<commit_message>
REFACTOR Ajout d’icônes FontAwesome boutons et bouton Edit dans _ZombieCard
Ajout de la librairie FontAwesome, ajout des icônes avec le texte sur les boutons et un bouton Edit dans la vue partielle _ZombieCard.
</commit_message>
<xml_diff>
--- a/S10_Lab1_Instructions.docx
+++ b/S10_Lab1_Instructions.docx
@@ -406,31 +406,7 @@
           <w:sz w:val="19"/>
           <w:szCs w:val="19"/>
         </w:rPr>
-        <w:t>&amp;</w:t>
-      </w:r>
-      <w:proofErr w:type="spellStart"/>
-      <w:r>
-        <w:rPr>
-          <w:rFonts w:ascii="Cascadia Mono" w:hAnsi="Cascadia Mono" w:cs="Cascadia Mono"/>
-          <w:b/>
-          <w:bCs/>
-          <w:color w:val="000000"/>
-          <w:sz w:val="19"/>
-          <w:szCs w:val="19"/>
-        </w:rPr>
-        <w:t>nbsp</w:t>
-      </w:r>
-      <w:proofErr w:type="spellEnd"/>
-      <w:r>
-        <w:rPr>
-          <w:rFonts w:ascii="Cascadia Mono" w:hAnsi="Cascadia Mono" w:cs="Cascadia Mono"/>
-          <w:b/>
-          <w:bCs/>
-          <w:color w:val="000000"/>
-          <w:sz w:val="19"/>
-          <w:szCs w:val="19"/>
-        </w:rPr>
-        <w:t>;</w:t>
+        <w:t>&amp;nbsp;</w:t>
       </w:r>
       <w:r>
         <w:rPr>
@@ -550,34 +526,14 @@
         <w:spacing w:before="0" w:after="160" w:line="259" w:lineRule="auto"/>
       </w:pPr>
       <w:r>
-        <w:t>« Dé-</w:t>
-      </w:r>
-      <w:proofErr w:type="spellStart"/>
-      <w:r>
-        <w:t>zipez</w:t>
-      </w:r>
-      <w:proofErr w:type="spellEnd"/>
-      <w:r>
-        <w:t xml:space="preserve"> » le fichier dans le dossier </w:t>
-      </w:r>
-      <w:proofErr w:type="spellStart"/>
-      <w:r>
-        <w:t>www</w:t>
-      </w:r>
-      <w:r>
-        <w:rPr>
-          <w:b/>
-          <w:bCs/>
-        </w:rPr>
-        <w:t>root</w:t>
-      </w:r>
-      <w:proofErr w:type="spellEnd"/>
-      <w:r>
-        <w:rPr>
-          <w:b/>
-          <w:bCs/>
-        </w:rPr>
-        <w:t>/</w:t>
+        <w:t>« Dé-zipez » le fichier dans le dossier www</w:t>
+      </w:r>
+      <w:r>
+        <w:rPr>
+          <w:b/>
+          <w:bCs/>
+        </w:rPr>
+        <w:t>root/</w:t>
       </w:r>
       <w:r>
         <w:rPr>
@@ -619,7 +575,6 @@
       <w:r>
         <w:t xml:space="preserve">, mettre seulement </w:t>
       </w:r>
-      <w:proofErr w:type="spellStart"/>
       <w:r>
         <w:rPr>
           <w:b/>
@@ -641,7 +596,6 @@
         </w:rPr>
         <w:t>some</w:t>
       </w:r>
-      <w:proofErr w:type="spellEnd"/>
       <w:r>
         <w:t xml:space="preserve">). </w:t>
       </w:r>
@@ -664,7 +618,6 @@
       <w:r>
         <w:t xml:space="preserve"> les sous-dossiers inutiles, soit tous sauf </w:t>
       </w:r>
-      <w:proofErr w:type="spellStart"/>
       <w:r>
         <w:rPr>
           <w:b/>
@@ -679,11 +632,9 @@
         </w:rPr>
         <w:t>s</w:t>
       </w:r>
-      <w:proofErr w:type="spellEnd"/>
       <w:r>
         <w:t xml:space="preserve"> et </w:t>
       </w:r>
-      <w:proofErr w:type="spellStart"/>
       <w:r>
         <w:rPr>
           <w:b/>
@@ -691,7 +642,6 @@
         </w:rPr>
         <w:t>css</w:t>
       </w:r>
-      <w:proofErr w:type="spellEnd"/>
     </w:p>
     <w:p>
       <w:pPr>
@@ -710,17 +660,8 @@
           <w:b/>
           <w:bCs/>
         </w:rPr>
-        <w:t>_</w:t>
-      </w:r>
-      <w:proofErr w:type="spellStart"/>
-      <w:r>
-        <w:rPr>
-          <w:b/>
-          <w:bCs/>
-        </w:rPr>
-        <w:t>Layout</w:t>
-      </w:r>
-      <w:proofErr w:type="spellEnd"/>
+        <w:t>_Layout</w:t>
+      </w:r>
     </w:p>
     <w:p>
       <w:pPr>
@@ -802,20 +743,8 @@
           <w:szCs w:val="19"/>
           <w:lang w:val="en-CA"/>
         </w:rPr>
-        <w:t xml:space="preserve">] - </w:t>
-      </w:r>
-      <w:proofErr w:type="spellStart"/>
-      <w:r>
-        <w:rPr>
-          <w:rFonts w:ascii="Cascadia Mono" w:hAnsi="Cascadia Mono" w:cs="Cascadia Mono"/>
-          <w:color w:val="000000"/>
-          <w:sz w:val="19"/>
-          <w:szCs w:val="19"/>
-          <w:lang w:val="en-CA"/>
-        </w:rPr>
-        <w:t>ZombieParty</w:t>
-      </w:r>
-      <w:proofErr w:type="spellEnd"/>
+        <w:t>] - ZombieParty</w:t>
+      </w:r>
       <w:r>
         <w:rPr>
           <w:rFonts w:ascii="Cascadia Mono" w:hAnsi="Cascadia Mono" w:cs="Cascadia Mono"/>
@@ -907,9 +836,18 @@
           <w:szCs w:val="19"/>
           <w:lang w:val="en-CA"/>
         </w:rPr>
-        <w:t xml:space="preserve"> </w:t>
-      </w:r>
-      <w:proofErr w:type="spellStart"/>
+        <w:t xml:space="preserve"> rel</w:t>
+      </w:r>
+      <w:r>
+        <w:rPr>
+          <w:rFonts w:ascii="Cascadia Mono" w:hAnsi="Cascadia Mono" w:cs="Cascadia Mono"/>
+          <w:color w:val="0000FF"/>
+          <w:sz w:val="19"/>
+          <w:szCs w:val="19"/>
+          <w:lang w:val="en-CA"/>
+        </w:rPr>
+        <w:t>=</w:t>
+      </w:r>
       <w:r>
         <w:rPr>
           <w:rFonts w:ascii="Cascadia Mono" w:hAnsi="Cascadia Mono" w:cs="Cascadia Mono"/>
@@ -918,9 +856,8 @@
           <w:szCs w:val="19"/>
           <w:lang w:val="en-CA"/>
         </w:rPr>
-        <w:t>rel</w:t>
-      </w:r>
-      <w:proofErr w:type="spellEnd"/>
+        <w:t>"stylesheet" href</w:t>
+      </w:r>
       <w:r>
         <w:rPr>
           <w:rFonts w:ascii="Cascadia Mono" w:hAnsi="Cascadia Mono" w:cs="Cascadia Mono"/>
@@ -939,83 +876,7 @@
           <w:szCs w:val="19"/>
           <w:lang w:val="en-CA"/>
         </w:rPr>
-        <w:t xml:space="preserve">"stylesheet" </w:t>
-      </w:r>
-      <w:proofErr w:type="spellStart"/>
-      <w:r>
-        <w:rPr>
-          <w:rFonts w:ascii="Cascadia Mono" w:hAnsi="Cascadia Mono" w:cs="Cascadia Mono"/>
-          <w:color w:val="000000"/>
-          <w:sz w:val="19"/>
-          <w:szCs w:val="19"/>
-          <w:lang w:val="en-CA"/>
-        </w:rPr>
-        <w:t>href</w:t>
-      </w:r>
-      <w:proofErr w:type="spellEnd"/>
-      <w:r>
-        <w:rPr>
-          <w:rFonts w:ascii="Cascadia Mono" w:hAnsi="Cascadia Mono" w:cs="Cascadia Mono"/>
-          <w:color w:val="0000FF"/>
-          <w:sz w:val="19"/>
-          <w:szCs w:val="19"/>
-          <w:lang w:val="en-CA"/>
-        </w:rPr>
-        <w:t>=</w:t>
-      </w:r>
-      <w:r>
-        <w:rPr>
-          <w:rFonts w:ascii="Cascadia Mono" w:hAnsi="Cascadia Mono" w:cs="Cascadia Mono"/>
-          <w:color w:val="000000"/>
-          <w:sz w:val="19"/>
-          <w:szCs w:val="19"/>
-          <w:lang w:val="en-CA"/>
-        </w:rPr>
-        <w:t>"~/lib/bootstrap/</w:t>
-      </w:r>
-      <w:proofErr w:type="spellStart"/>
-      <w:r>
-        <w:rPr>
-          <w:rFonts w:ascii="Cascadia Mono" w:hAnsi="Cascadia Mono" w:cs="Cascadia Mono"/>
-          <w:color w:val="000000"/>
-          <w:sz w:val="19"/>
-          <w:szCs w:val="19"/>
-          <w:lang w:val="en-CA"/>
-        </w:rPr>
-        <w:t>dist</w:t>
-      </w:r>
-      <w:proofErr w:type="spellEnd"/>
-      <w:r>
-        <w:rPr>
-          <w:rFonts w:ascii="Cascadia Mono" w:hAnsi="Cascadia Mono" w:cs="Cascadia Mono"/>
-          <w:color w:val="000000"/>
-          <w:sz w:val="19"/>
-          <w:szCs w:val="19"/>
-          <w:lang w:val="en-CA"/>
-        </w:rPr>
-        <w:t>/</w:t>
-      </w:r>
-      <w:proofErr w:type="spellStart"/>
-      <w:r>
-        <w:rPr>
-          <w:rFonts w:ascii="Cascadia Mono" w:hAnsi="Cascadia Mono" w:cs="Cascadia Mono"/>
-          <w:color w:val="000000"/>
-          <w:sz w:val="19"/>
-          <w:szCs w:val="19"/>
-          <w:lang w:val="en-CA"/>
-        </w:rPr>
-        <w:t>css</w:t>
-      </w:r>
-      <w:proofErr w:type="spellEnd"/>
-      <w:r>
-        <w:rPr>
-          <w:rFonts w:ascii="Cascadia Mono" w:hAnsi="Cascadia Mono" w:cs="Cascadia Mono"/>
-          <w:color w:val="000000"/>
-          <w:sz w:val="19"/>
-          <w:szCs w:val="19"/>
-          <w:lang w:val="en-CA"/>
-        </w:rPr>
-        <w:t xml:space="preserve">/bootstrap.min.css" </w:t>
+        <w:t xml:space="preserve">"~/lib/bootstrap/dist/css/bootstrap.min.css" </w:t>
       </w:r>
       <w:r>
         <w:rPr>
@@ -1091,9 +952,19 @@
           <w:highlight w:val="green"/>
           <w:lang w:val="en-CA"/>
         </w:rPr>
-        <w:t xml:space="preserve"> </w:t>
-      </w:r>
-      <w:proofErr w:type="spellStart"/>
+        <w:t xml:space="preserve"> href</w:t>
+      </w:r>
+      <w:r>
+        <w:rPr>
+          <w:rFonts w:ascii="Cascadia Mono" w:hAnsi="Cascadia Mono" w:cs="Cascadia Mono"/>
+          <w:color w:val="0000FF"/>
+          <w:sz w:val="19"/>
+          <w:szCs w:val="19"/>
+          <w:highlight w:val="green"/>
+          <w:lang w:val="en-CA"/>
+        </w:rPr>
+        <w:t>=</w:t>
+      </w:r>
       <w:r>
         <w:rPr>
           <w:rFonts w:ascii="Cascadia Mono" w:hAnsi="Cascadia Mono" w:cs="Cascadia Mono"/>
@@ -1103,92 +974,8 @@
           <w:highlight w:val="green"/>
           <w:lang w:val="en-CA"/>
         </w:rPr>
-        <w:t>href</w:t>
-      </w:r>
-      <w:proofErr w:type="spellEnd"/>
-      <w:r>
-        <w:rPr>
-          <w:rFonts w:ascii="Cascadia Mono" w:hAnsi="Cascadia Mono" w:cs="Cascadia Mono"/>
-          <w:color w:val="0000FF"/>
-          <w:sz w:val="19"/>
-          <w:szCs w:val="19"/>
-          <w:highlight w:val="green"/>
-          <w:lang w:val="en-CA"/>
-        </w:rPr>
-        <w:t>=</w:t>
-      </w:r>
-      <w:r>
-        <w:rPr>
-          <w:rFonts w:ascii="Cascadia Mono" w:hAnsi="Cascadia Mono" w:cs="Cascadia Mono"/>
-          <w:color w:val="000000"/>
-          <w:sz w:val="19"/>
-          <w:szCs w:val="19"/>
-          <w:highlight w:val="green"/>
-          <w:lang w:val="en-CA"/>
-        </w:rPr>
-        <w:t>"~/</w:t>
-      </w:r>
-      <w:proofErr w:type="spellStart"/>
-      <w:r>
-        <w:rPr>
-          <w:rFonts w:ascii="Cascadia Mono" w:hAnsi="Cascadia Mono" w:cs="Cascadia Mono"/>
-          <w:color w:val="000000"/>
-          <w:sz w:val="19"/>
-          <w:szCs w:val="19"/>
-          <w:highlight w:val="green"/>
-          <w:lang w:val="en-CA"/>
-        </w:rPr>
-        <w:t>fontawesome</w:t>
-      </w:r>
-      <w:proofErr w:type="spellEnd"/>
-      <w:r>
-        <w:rPr>
-          <w:rFonts w:ascii="Cascadia Mono" w:hAnsi="Cascadia Mono" w:cs="Cascadia Mono"/>
-          <w:color w:val="000000"/>
-          <w:sz w:val="19"/>
-          <w:szCs w:val="19"/>
-          <w:highlight w:val="green"/>
-          <w:lang w:val="en-CA"/>
-        </w:rPr>
-        <w:t>/</w:t>
-      </w:r>
-      <w:proofErr w:type="spellStart"/>
-      <w:r>
-        <w:rPr>
-          <w:rFonts w:ascii="Cascadia Mono" w:hAnsi="Cascadia Mono" w:cs="Cascadia Mono"/>
-          <w:color w:val="000000"/>
-          <w:sz w:val="19"/>
-          <w:szCs w:val="19"/>
-          <w:highlight w:val="green"/>
-          <w:lang w:val="en-CA"/>
-        </w:rPr>
-        <w:t>css</w:t>
-      </w:r>
-      <w:proofErr w:type="spellEnd"/>
-      <w:r>
-        <w:rPr>
-          <w:rFonts w:ascii="Cascadia Mono" w:hAnsi="Cascadia Mono" w:cs="Cascadia Mono"/>
-          <w:color w:val="000000"/>
-          <w:sz w:val="19"/>
-          <w:szCs w:val="19"/>
-          <w:highlight w:val="green"/>
-          <w:lang w:val="en-CA"/>
-        </w:rPr>
-        <w:t xml:space="preserve">/all.css" </w:t>
-      </w:r>
-      <w:proofErr w:type="spellStart"/>
-      <w:r>
-        <w:rPr>
-          <w:rFonts w:ascii="Cascadia Mono" w:hAnsi="Cascadia Mono" w:cs="Cascadia Mono"/>
-          <w:color w:val="000000"/>
-          <w:sz w:val="19"/>
-          <w:szCs w:val="19"/>
-          <w:highlight w:val="green"/>
-          <w:lang w:val="en-CA"/>
-        </w:rPr>
-        <w:t>rel</w:t>
-      </w:r>
-      <w:proofErr w:type="spellEnd"/>
+        <w:t>"~/fontawesome/css/all.css" rel</w:t>
+      </w:r>
       <w:r>
         <w:rPr>
           <w:rFonts w:ascii="Cascadia Mono" w:hAnsi="Cascadia Mono" w:cs="Cascadia Mono"/>
@@ -1283,9 +1070,18 @@
           <w:szCs w:val="19"/>
           <w:lang w:val="en-CA"/>
         </w:rPr>
-        <w:t xml:space="preserve"> </w:t>
-      </w:r>
-      <w:proofErr w:type="spellStart"/>
+        <w:t xml:space="preserve"> rel</w:t>
+      </w:r>
+      <w:r>
+        <w:rPr>
+          <w:rFonts w:ascii="Cascadia Mono" w:hAnsi="Cascadia Mono" w:cs="Cascadia Mono"/>
+          <w:color w:val="0000FF"/>
+          <w:sz w:val="19"/>
+          <w:szCs w:val="19"/>
+          <w:lang w:val="en-CA"/>
+        </w:rPr>
+        <w:t>=</w:t>
+      </w:r>
       <w:r>
         <w:rPr>
           <w:rFonts w:ascii="Cascadia Mono" w:hAnsi="Cascadia Mono" w:cs="Cascadia Mono"/>
@@ -1294,9 +1090,8 @@
           <w:szCs w:val="19"/>
           <w:lang w:val="en-CA"/>
         </w:rPr>
-        <w:t>rel</w:t>
-      </w:r>
-      <w:proofErr w:type="spellEnd"/>
+        <w:t>"stylesheet" href</w:t>
+      </w:r>
       <w:r>
         <w:rPr>
           <w:rFonts w:ascii="Cascadia Mono" w:hAnsi="Cascadia Mono" w:cs="Cascadia Mono"/>
@@ -1315,61 +1110,7 @@
           <w:szCs w:val="19"/>
           <w:lang w:val="en-CA"/>
         </w:rPr>
-        <w:t xml:space="preserve">"stylesheet" </w:t>
-      </w:r>
-      <w:proofErr w:type="spellStart"/>
-      <w:r>
-        <w:rPr>
-          <w:rFonts w:ascii="Cascadia Mono" w:hAnsi="Cascadia Mono" w:cs="Cascadia Mono"/>
-          <w:color w:val="000000"/>
-          <w:sz w:val="19"/>
-          <w:szCs w:val="19"/>
-          <w:lang w:val="en-CA"/>
-        </w:rPr>
-        <w:t>href</w:t>
-      </w:r>
-      <w:proofErr w:type="spellEnd"/>
-      <w:r>
-        <w:rPr>
-          <w:rFonts w:ascii="Cascadia Mono" w:hAnsi="Cascadia Mono" w:cs="Cascadia Mono"/>
-          <w:color w:val="0000FF"/>
-          <w:sz w:val="19"/>
-          <w:szCs w:val="19"/>
-          <w:lang w:val="en-CA"/>
-        </w:rPr>
-        <w:t>=</w:t>
-      </w:r>
-      <w:r>
-        <w:rPr>
-          <w:rFonts w:ascii="Cascadia Mono" w:hAnsi="Cascadia Mono" w:cs="Cascadia Mono"/>
-          <w:color w:val="000000"/>
-          <w:sz w:val="19"/>
-          <w:szCs w:val="19"/>
-          <w:lang w:val="en-CA"/>
-        </w:rPr>
-        <w:t>"~/</w:t>
-      </w:r>
-      <w:proofErr w:type="spellStart"/>
-      <w:r>
-        <w:rPr>
-          <w:rFonts w:ascii="Cascadia Mono" w:hAnsi="Cascadia Mono" w:cs="Cascadia Mono"/>
-          <w:color w:val="000000"/>
-          <w:sz w:val="19"/>
-          <w:szCs w:val="19"/>
-          <w:lang w:val="en-CA"/>
-        </w:rPr>
-        <w:t>css</w:t>
-      </w:r>
-      <w:proofErr w:type="spellEnd"/>
-      <w:r>
-        <w:rPr>
-          <w:rFonts w:ascii="Cascadia Mono" w:hAnsi="Cascadia Mono" w:cs="Cascadia Mono"/>
-          <w:color w:val="000000"/>
-          <w:sz w:val="19"/>
-          <w:szCs w:val="19"/>
-          <w:lang w:val="en-CA"/>
-        </w:rPr>
-        <w:t>/site.css" asp-append-version</w:t>
+        <w:t>"~/css/site.css" asp-append-version</w:t>
       </w:r>
       <w:r>
         <w:rPr>
@@ -1462,9 +1203,18 @@
           <w:szCs w:val="19"/>
           <w:lang w:val="en-CA"/>
         </w:rPr>
-        <w:t xml:space="preserve"> </w:t>
-      </w:r>
-      <w:proofErr w:type="spellStart"/>
+        <w:t xml:space="preserve"> rel</w:t>
+      </w:r>
+      <w:r>
+        <w:rPr>
+          <w:rFonts w:ascii="Cascadia Mono" w:hAnsi="Cascadia Mono" w:cs="Cascadia Mono"/>
+          <w:color w:val="0000FF"/>
+          <w:sz w:val="19"/>
+          <w:szCs w:val="19"/>
+          <w:lang w:val="en-CA"/>
+        </w:rPr>
+        <w:t>=</w:t>
+      </w:r>
       <w:r>
         <w:rPr>
           <w:rFonts w:ascii="Cascadia Mono" w:hAnsi="Cascadia Mono" w:cs="Cascadia Mono"/>
@@ -1473,41 +1223,8 @@
           <w:szCs w:val="19"/>
           <w:lang w:val="en-CA"/>
         </w:rPr>
-        <w:t>rel</w:t>
-      </w:r>
-      <w:proofErr w:type="spellEnd"/>
-      <w:r>
-        <w:rPr>
-          <w:rFonts w:ascii="Cascadia Mono" w:hAnsi="Cascadia Mono" w:cs="Cascadia Mono"/>
-          <w:color w:val="0000FF"/>
-          <w:sz w:val="19"/>
-          <w:szCs w:val="19"/>
-          <w:lang w:val="en-CA"/>
-        </w:rPr>
-        <w:t>=</w:t>
-      </w:r>
-      <w:r>
-        <w:rPr>
-          <w:rFonts w:ascii="Cascadia Mono" w:hAnsi="Cascadia Mono" w:cs="Cascadia Mono"/>
-          <w:color w:val="000000"/>
-          <w:sz w:val="19"/>
-          <w:szCs w:val="19"/>
-          <w:lang w:val="en-CA"/>
-        </w:rPr>
-        <w:t xml:space="preserve">"stylesheet" </w:t>
-      </w:r>
-      <w:proofErr w:type="spellStart"/>
-      <w:r>
-        <w:rPr>
-          <w:rFonts w:ascii="Cascadia Mono" w:hAnsi="Cascadia Mono" w:cs="Cascadia Mono"/>
-          <w:color w:val="000000"/>
-          <w:sz w:val="19"/>
-          <w:szCs w:val="19"/>
-          <w:lang w:val="en-CA"/>
-        </w:rPr>
-        <w:t>href</w:t>
-      </w:r>
-      <w:proofErr w:type="spellEnd"/>
+        <w:t>"stylesheet" href</w:t>
+      </w:r>
       <w:r>
         <w:rPr>
           <w:rFonts w:ascii="Cascadia Mono" w:hAnsi="Cascadia Mono" w:cs="Cascadia Mono"/>
@@ -1580,7 +1297,6 @@
         </w:rPr>
         <w:t>&lt;/</w:t>
       </w:r>
-      <w:proofErr w:type="spellStart"/>
       <w:r>
         <w:rPr>
           <w:rFonts w:ascii="Cascadia Mono" w:hAnsi="Cascadia Mono" w:cs="Cascadia Mono"/>
@@ -1590,7 +1306,6 @@
         </w:rPr>
         <w:t>head</w:t>
       </w:r>
-      <w:proofErr w:type="spellEnd"/>
       <w:r>
         <w:rPr>
           <w:rFonts w:ascii="Cascadia Mono" w:hAnsi="Cascadia Mono" w:cs="Cascadia Mono"/>
@@ -1636,7 +1351,6 @@
       <w:r>
         <w:t xml:space="preserve">Sur le site de Font Awesome, cliquez sur </w:t>
       </w:r>
-      <w:proofErr w:type="spellStart"/>
       <w:r>
         <w:rPr>
           <w:b/>
@@ -1644,7 +1358,6 @@
         </w:rPr>
         <w:t>Icons</w:t>
       </w:r>
-      <w:proofErr w:type="spellEnd"/>
       <w:r>
         <w:rPr>
           <w:b/>
@@ -1712,17 +1425,8 @@
           <w:i/>
           <w:iCs/>
         </w:rPr>
-        <w:t xml:space="preserve"> Left </w:t>
-      </w:r>
-      <w:proofErr w:type="spellStart"/>
-      <w:r>
-        <w:rPr>
-          <w:i/>
-          <w:iCs/>
-        </w:rPr>
-        <w:t>arrow</w:t>
-      </w:r>
-      <w:proofErr w:type="spellEnd"/>
+        <w:t xml:space="preserve"> Left arrow</w:t>
+      </w:r>
     </w:p>
     <w:p>
       <w:pPr>
@@ -1776,21 +1480,7 @@
         <w:rPr>
           <w:rFonts w:ascii="Courier New" w:hAnsi="Courier New" w:cs="Courier New"/>
         </w:rPr>
-        <w:t>&lt;i class="</w:t>
-      </w:r>
-      <w:proofErr w:type="spellStart"/>
-      <w:r>
-        <w:rPr>
-          <w:rFonts w:ascii="Courier New" w:hAnsi="Courier New" w:cs="Courier New"/>
-        </w:rPr>
-        <w:t>fas</w:t>
-      </w:r>
-      <w:proofErr w:type="spellEnd"/>
-      <w:r>
-        <w:rPr>
-          <w:rFonts w:ascii="Courier New" w:hAnsi="Courier New" w:cs="Courier New"/>
-        </w:rPr>
-        <w:t xml:space="preserve"> fa-plus-</w:t>
+        <w:t>&lt;i class="fas fa-plus-</w:t>
       </w:r>
       <w:r>
         <w:rPr>
@@ -1863,18 +1553,8 @@
                 <w:bCs/>
                 <w:color w:val="FFFFFF" w:themeColor="background1"/>
               </w:rPr>
-              <w:t xml:space="preserve">Code </w:t>
+              <w:t>Code Fontawesome</w:t>
             </w:r>
-            <w:proofErr w:type="spellStart"/>
-            <w:r>
-              <w:rPr>
-                <w:b/>
-                <w:bCs/>
-                <w:color w:val="FFFFFF" w:themeColor="background1"/>
-              </w:rPr>
-              <w:t>Fontawesome</w:t>
-            </w:r>
-            <w:proofErr w:type="spellEnd"/>
           </w:p>
         </w:tc>
       </w:tr>
@@ -1912,101 +1592,8 @@
               <w:spacing w:after="160" w:line="259" w:lineRule="auto"/>
               <w:ind w:left="3"/>
             </w:pPr>
-            <w:proofErr w:type="spellStart"/>
             <w:r>
-              <w:rPr>
-                <w:b/>
-                <w:bCs/>
-              </w:rPr>
-              <w:t>Exemple</w:t>
-            </w:r>
-            <w:proofErr w:type="spellEnd"/>
-            <w:r>
-              <w:t xml:space="preserve">: </w:t>
-            </w:r>
-            <w:r>
-              <w:rPr>
-                <w:rFonts w:ascii="Cascadia Mono" w:hAnsi="Cascadia Mono" w:cs="Cascadia Mono"/>
-                <w:color w:val="0000FF"/>
-                <w:sz w:val="19"/>
-                <w:szCs w:val="19"/>
-                <w14:ligatures w14:val="standardContextual"/>
-              </w:rPr>
-              <w:t>&lt;</w:t>
-            </w:r>
-            <w:proofErr w:type="spellStart"/>
-            <w:r>
-              <w:rPr>
-                <w:rFonts w:ascii="Cascadia Mono" w:hAnsi="Cascadia Mono" w:cs="Cascadia Mono"/>
-                <w:color w:val="800000"/>
-                <w:sz w:val="19"/>
-                <w:szCs w:val="19"/>
-                <w14:ligatures w14:val="standardContextual"/>
-              </w:rPr>
-              <w:t>i</w:t>
-            </w:r>
-            <w:proofErr w:type="spellEnd"/>
-            <w:r>
-              <w:rPr>
-                <w:rFonts w:ascii="Cascadia Mono" w:hAnsi="Cascadia Mono" w:cs="Cascadia Mono"/>
-                <w:color w:val="000000"/>
-                <w:sz w:val="19"/>
-                <w:szCs w:val="19"/>
-                <w14:ligatures w14:val="standardContextual"/>
-              </w:rPr>
-              <w:t xml:space="preserve"> class</w:t>
-            </w:r>
-            <w:r>
-              <w:rPr>
-                <w:rFonts w:ascii="Cascadia Mono" w:hAnsi="Cascadia Mono" w:cs="Cascadia Mono"/>
-                <w:color w:val="0000FF"/>
-                <w:sz w:val="19"/>
-                <w:szCs w:val="19"/>
-                <w14:ligatures w14:val="standardContextual"/>
-              </w:rPr>
-              <w:t>=</w:t>
-            </w:r>
-            <w:r>
-              <w:rPr>
-                <w:rFonts w:ascii="Cascadia Mono" w:hAnsi="Cascadia Mono" w:cs="Cascadia Mono"/>
-                <w:color w:val="000000"/>
-                <w:sz w:val="19"/>
-                <w:szCs w:val="19"/>
-                <w14:ligatures w14:val="standardContextual"/>
-              </w:rPr>
-              <w:t>"fa-solid fa-circle-arrow-left"</w:t>
-            </w:r>
-            <w:r>
-              <w:rPr>
-                <w:rFonts w:ascii="Cascadia Mono" w:hAnsi="Cascadia Mono" w:cs="Cascadia Mono"/>
-                <w:color w:val="0000FF"/>
-                <w:sz w:val="19"/>
-                <w:szCs w:val="19"/>
-                <w14:ligatures w14:val="standardContextual"/>
-              </w:rPr>
-              <w:t>&gt;&lt;/</w:t>
-            </w:r>
-            <w:proofErr w:type="spellStart"/>
-            <w:r>
-              <w:rPr>
-                <w:rFonts w:ascii="Cascadia Mono" w:hAnsi="Cascadia Mono" w:cs="Cascadia Mono"/>
-                <w:color w:val="800000"/>
-                <w:sz w:val="19"/>
-                <w:szCs w:val="19"/>
-                <w14:ligatures w14:val="standardContextual"/>
-              </w:rPr>
-              <w:t>i</w:t>
-            </w:r>
-            <w:proofErr w:type="spellEnd"/>
-            <w:r>
-              <w:rPr>
-                <w:rFonts w:ascii="Cascadia Mono" w:hAnsi="Cascadia Mono" w:cs="Cascadia Mono"/>
-                <w:color w:val="0000FF"/>
-                <w:sz w:val="19"/>
-                <w:szCs w:val="19"/>
-                <w14:ligatures w14:val="standardContextual"/>
-              </w:rPr>
-              <w:t>&gt;</w:t>
+              <w:t>&lt;i class="fa-solid fa-arrow-left"&gt;&lt;/i&gt;</w:t>
             </w:r>
           </w:p>
         </w:tc>
@@ -2035,6 +1622,9 @@
               <w:spacing w:after="160" w:line="259" w:lineRule="auto"/>
               <w:ind w:left="3"/>
             </w:pPr>
+            <w:r>
+              <w:t>&lt;i class="fa-solid fa-plus"&gt;&lt;/i&gt;</w:t>
+            </w:r>
           </w:p>
         </w:tc>
       </w:tr>
@@ -2062,6 +1652,9 @@
               <w:spacing w:after="160" w:line="259" w:lineRule="auto"/>
               <w:ind w:left="3"/>
             </w:pPr>
+            <w:r>
+              <w:t>&lt;i class="fa-solid fa-pen"&gt;&lt;/i&gt;</w:t>
+            </w:r>
           </w:p>
         </w:tc>
       </w:tr>
@@ -2089,6 +1682,9 @@
               <w:spacing w:after="160" w:line="259" w:lineRule="auto"/>
               <w:ind w:left="3"/>
             </w:pPr>
+            <w:r>
+              <w:t>&lt;i class="fa-solid fa-trash-can"&gt;&lt;/i&gt;</w:t>
+            </w:r>
           </w:p>
         </w:tc>
       </w:tr>
@@ -2116,6 +1712,9 @@
               <w:spacing w:after="160" w:line="259" w:lineRule="auto"/>
               <w:ind w:left="3"/>
             </w:pPr>
+            <w:r>
+              <w:t>&lt;i class="fa-solid fa-list-ul"&gt;&lt;/i&gt;</w:t>
+            </w:r>
           </w:p>
         </w:tc>
       </w:tr>
@@ -2172,7 +1771,6 @@
       <w:r>
         <w:t xml:space="preserve"> les liens de création, d’édition, de suppression et de retour en ajoutant une icône </w:t>
       </w:r>
-      <w:proofErr w:type="spellStart"/>
       <w:r>
         <w:rPr>
           <w:b/>
@@ -2180,11 +1778,9 @@
         </w:rPr>
         <w:t>FontAwesome</w:t>
       </w:r>
-      <w:proofErr w:type="spellEnd"/>
       <w:r>
         <w:t xml:space="preserve">, un espace insécable et un format de bouton </w:t>
       </w:r>
-      <w:proofErr w:type="spellStart"/>
       <w:r>
         <w:rPr>
           <w:b/>
@@ -2192,7 +1788,6 @@
         </w:rPr>
         <w:t>bootstrap</w:t>
       </w:r>
-      <w:proofErr w:type="spellEnd"/>
       <w:r>
         <w:t xml:space="preserve"> approprié</w:t>
       </w:r>
@@ -2339,9 +1934,18 @@
           <w:szCs w:val="19"/>
           <w:lang w:val="en-CA"/>
         </w:rPr>
-        <w:t>"</w:t>
-      </w:r>
-      <w:proofErr w:type="spellStart"/>
+        <w:t>"btn btn-success" asp-action</w:t>
+      </w:r>
+      <w:r>
+        <w:rPr>
+          <w:rFonts w:ascii="Cascadia Mono" w:hAnsi="Cascadia Mono" w:cs="Cascadia Mono"/>
+          <w:color w:val="0000FF"/>
+          <w:sz w:val="19"/>
+          <w:szCs w:val="19"/>
+          <w:lang w:val="en-CA"/>
+        </w:rPr>
+        <w:t>=</w:t>
+      </w:r>
       <w:r>
         <w:rPr>
           <w:rFonts w:ascii="Cascadia Mono" w:hAnsi="Cascadia Mono" w:cs="Cascadia Mono"/>
@@ -2350,82 +1954,7 @@
           <w:szCs w:val="19"/>
           <w:lang w:val="en-CA"/>
         </w:rPr>
-        <w:t>btn</w:t>
-      </w:r>
-      <w:proofErr w:type="spellEnd"/>
-      <w:r>
-        <w:rPr>
-          <w:rFonts w:ascii="Cascadia Mono" w:hAnsi="Cascadia Mono" w:cs="Cascadia Mono"/>
-          <w:color w:val="000000"/>
-          <w:sz w:val="19"/>
-          <w:szCs w:val="19"/>
-          <w:lang w:val="en-CA"/>
-        </w:rPr>
-        <w:t xml:space="preserve"> </w:t>
-      </w:r>
-      <w:proofErr w:type="spellStart"/>
-      <w:r>
-        <w:rPr>
-          <w:rFonts w:ascii="Cascadia Mono" w:hAnsi="Cascadia Mono" w:cs="Cascadia Mono"/>
-          <w:color w:val="000000"/>
-          <w:sz w:val="19"/>
-          <w:szCs w:val="19"/>
-          <w:lang w:val="en-CA"/>
-        </w:rPr>
-        <w:t>btn</w:t>
-      </w:r>
-      <w:proofErr w:type="spellEnd"/>
-      <w:r>
-        <w:rPr>
-          <w:rFonts w:ascii="Cascadia Mono" w:hAnsi="Cascadia Mono" w:cs="Cascadia Mono"/>
-          <w:color w:val="000000"/>
-          <w:sz w:val="19"/>
-          <w:szCs w:val="19"/>
-          <w:lang w:val="en-CA"/>
-        </w:rPr>
-        <w:t>-success" asp-action</w:t>
-      </w:r>
-      <w:r>
-        <w:rPr>
-          <w:rFonts w:ascii="Cascadia Mono" w:hAnsi="Cascadia Mono" w:cs="Cascadia Mono"/>
-          <w:color w:val="0000FF"/>
-          <w:sz w:val="19"/>
-          <w:szCs w:val="19"/>
-          <w:lang w:val="en-CA"/>
-        </w:rPr>
-        <w:t>=</w:t>
-      </w:r>
-      <w:r>
-        <w:rPr>
-          <w:rFonts w:ascii="Cascadia Mono" w:hAnsi="Cascadia Mono" w:cs="Cascadia Mono"/>
-          <w:color w:val="000000"/>
-          <w:sz w:val="19"/>
-          <w:szCs w:val="19"/>
-          <w:lang w:val="en-CA"/>
-        </w:rPr>
-        <w:t>"</w:t>
-      </w:r>
-      <w:proofErr w:type="spellStart"/>
-      <w:r>
-        <w:rPr>
-          <w:rFonts w:ascii="Cascadia Mono" w:hAnsi="Cascadia Mono" w:cs="Cascadia Mono"/>
-          <w:color w:val="000000"/>
-          <w:sz w:val="19"/>
-          <w:szCs w:val="19"/>
-          <w:lang w:val="en-CA"/>
-        </w:rPr>
-        <w:t>Upsert</w:t>
-      </w:r>
-      <w:proofErr w:type="spellEnd"/>
-      <w:r>
-        <w:rPr>
-          <w:rFonts w:ascii="Cascadia Mono" w:hAnsi="Cascadia Mono" w:cs="Cascadia Mono"/>
-          <w:color w:val="000000"/>
-          <w:sz w:val="19"/>
-          <w:szCs w:val="19"/>
-          <w:lang w:val="en-CA"/>
-        </w:rPr>
-        <w:t>"</w:t>
+        <w:t>"Upsert"</w:t>
       </w:r>
       <w:r>
         <w:rPr>
@@ -2488,7 +2017,6 @@
           <w:lang w:val="en-US"/>
         </w:rPr>
       </w:pPr>
-      <w:proofErr w:type="spellStart"/>
       <w:r>
         <w:rPr>
           <w:b/>
@@ -2507,7 +2035,6 @@
         </w:rPr>
         <w:t>ont</w:t>
       </w:r>
-      <w:proofErr w:type="spellEnd"/>
       <w:r>
         <w:rPr>
           <w:b/>
@@ -2582,42 +2109,147 @@
           <w:szCs w:val="19"/>
           <w:lang w:val="en-CA"/>
         </w:rPr>
+        <w:t>"btn btn-success" asp-action</w:t>
+      </w:r>
+      <w:r>
+        <w:rPr>
+          <w:rFonts w:ascii="Cascadia Mono" w:hAnsi="Cascadia Mono" w:cs="Cascadia Mono"/>
+          <w:color w:val="0000FF"/>
+          <w:sz w:val="19"/>
+          <w:szCs w:val="19"/>
+          <w:lang w:val="en-CA"/>
+        </w:rPr>
+        <w:t>=</w:t>
+      </w:r>
+      <w:r>
+        <w:rPr>
+          <w:rFonts w:ascii="Cascadia Mono" w:hAnsi="Cascadia Mono" w:cs="Cascadia Mono"/>
+          <w:color w:val="000000"/>
+          <w:sz w:val="19"/>
+          <w:szCs w:val="19"/>
+          <w:lang w:val="en-CA"/>
+        </w:rPr>
+        <w:t>"Upsert</w:t>
+      </w:r>
+      <w:r>
+        <w:rPr>
+          <w:rFonts w:ascii="Cascadia Mono" w:hAnsi="Cascadia Mono" w:cs="Cascadia Mono"/>
+          <w:color w:val="000000"/>
+          <w:sz w:val="19"/>
+          <w:szCs w:val="19"/>
+          <w:lang w:val="en-CA"/>
+        </w:rPr>
         <w:t>"</w:t>
       </w:r>
-      <w:proofErr w:type="spellStart"/>
+      <w:r>
+        <w:rPr>
+          <w:rFonts w:ascii="Cascadia Mono" w:hAnsi="Cascadia Mono" w:cs="Cascadia Mono"/>
+          <w:color w:val="0000FF"/>
+          <w:sz w:val="19"/>
+          <w:szCs w:val="19"/>
+          <w:lang w:val="en-CA"/>
+        </w:rPr>
+        <w:t>&gt;</w:t>
+      </w:r>
+      <w:r>
+        <w:rPr>
+          <w:rFonts w:ascii="Cascadia Mono" w:hAnsi="Cascadia Mono" w:cs="Cascadia Mono"/>
+          <w:color w:val="0000FF"/>
+          <w:sz w:val="19"/>
+          <w:szCs w:val="19"/>
+          <w:highlight w:val="green"/>
+          <w:lang w:val="en-CA"/>
+        </w:rPr>
+        <w:t>&lt;</w:t>
+      </w:r>
+      <w:r>
+        <w:rPr>
+          <w:rFonts w:ascii="Cascadia Mono" w:hAnsi="Cascadia Mono" w:cs="Cascadia Mono"/>
+          <w:color w:val="800000"/>
+          <w:sz w:val="19"/>
+          <w:szCs w:val="19"/>
+          <w:highlight w:val="green"/>
+          <w:lang w:val="en-CA"/>
+        </w:rPr>
+        <w:t>i</w:t>
+      </w:r>
       <w:r>
         <w:rPr>
           <w:rFonts w:ascii="Cascadia Mono" w:hAnsi="Cascadia Mono" w:cs="Cascadia Mono"/>
           <w:color w:val="000000"/>
           <w:sz w:val="19"/>
           <w:szCs w:val="19"/>
-          <w:lang w:val="en-CA"/>
-        </w:rPr>
-        <w:t>btn</w:t>
-      </w:r>
-      <w:proofErr w:type="spellEnd"/>
+          <w:highlight w:val="green"/>
+          <w:lang w:val="en-CA"/>
+        </w:rPr>
+        <w:t xml:space="preserve"> class</w:t>
+      </w:r>
+      <w:r>
+        <w:rPr>
+          <w:rFonts w:ascii="Cascadia Mono" w:hAnsi="Cascadia Mono" w:cs="Cascadia Mono"/>
+          <w:color w:val="0000FF"/>
+          <w:sz w:val="19"/>
+          <w:szCs w:val="19"/>
+          <w:highlight w:val="green"/>
+          <w:lang w:val="en-CA"/>
+        </w:rPr>
+        <w:t>=</w:t>
+      </w:r>
       <w:r>
         <w:rPr>
           <w:rFonts w:ascii="Cascadia Mono" w:hAnsi="Cascadia Mono" w:cs="Cascadia Mono"/>
           <w:color w:val="000000"/>
           <w:sz w:val="19"/>
           <w:szCs w:val="19"/>
-          <w:lang w:val="en-CA"/>
-        </w:rPr>
-        <w:t xml:space="preserve"> </w:t>
-      </w:r>
-      <w:proofErr w:type="spellStart"/>
+          <w:highlight w:val="green"/>
+          <w:lang w:val="en-CA"/>
+        </w:rPr>
+        <w:t>"fas fa-plus-square"</w:t>
+      </w:r>
+      <w:r>
+        <w:rPr>
+          <w:rFonts w:ascii="Cascadia Mono" w:hAnsi="Cascadia Mono" w:cs="Cascadia Mono"/>
+          <w:color w:val="0000FF"/>
+          <w:sz w:val="19"/>
+          <w:szCs w:val="19"/>
+          <w:highlight w:val="green"/>
+          <w:lang w:val="en-CA"/>
+        </w:rPr>
+        <w:t>&gt;&lt;/</w:t>
+      </w:r>
+      <w:r>
+        <w:rPr>
+          <w:rFonts w:ascii="Cascadia Mono" w:hAnsi="Cascadia Mono" w:cs="Cascadia Mono"/>
+          <w:color w:val="800000"/>
+          <w:sz w:val="19"/>
+          <w:szCs w:val="19"/>
+          <w:highlight w:val="green"/>
+          <w:lang w:val="en-CA"/>
+        </w:rPr>
+        <w:t>i</w:t>
+      </w:r>
+      <w:r>
+        <w:rPr>
+          <w:rFonts w:ascii="Cascadia Mono" w:hAnsi="Cascadia Mono" w:cs="Cascadia Mono"/>
+          <w:color w:val="0000FF"/>
+          <w:sz w:val="19"/>
+          <w:szCs w:val="19"/>
+          <w:highlight w:val="green"/>
+          <w:lang w:val="en-CA"/>
+        </w:rPr>
+        <w:t>&gt;</w:t>
+      </w:r>
       <w:r>
         <w:rPr>
           <w:rFonts w:ascii="Cascadia Mono" w:hAnsi="Cascadia Mono" w:cs="Cascadia Mono"/>
           <w:color w:val="000000"/>
           <w:sz w:val="19"/>
           <w:szCs w:val="19"/>
-          <w:lang w:val="en-CA"/>
-        </w:rPr>
-        <w:t>btn</w:t>
-      </w:r>
-      <w:proofErr w:type="spellEnd"/>
+          <w:highlight w:val="green"/>
+          <w:lang w:val="en-CA"/>
+        </w:rPr>
+        <w:t>&amp;nbsp;</w:t>
+      </w:r>
       <w:r>
         <w:rPr>
           <w:rFonts w:ascii="Cascadia Mono" w:hAnsi="Cascadia Mono" w:cs="Cascadia Mono"/>
@@ -2626,7 +2258,7 @@
           <w:szCs w:val="19"/>
           <w:lang w:val="en-CA"/>
         </w:rPr>
-        <w:t>-success" asp-action</w:t>
+        <w:t>Create New</w:t>
       </w:r>
       <w:r>
         <w:rPr>
@@ -2636,39 +2268,17 @@
           <w:szCs w:val="19"/>
           <w:lang w:val="en-CA"/>
         </w:rPr>
-        <w:t>=</w:t>
-      </w:r>
-      <w:r>
-        <w:rPr>
-          <w:rFonts w:ascii="Cascadia Mono" w:hAnsi="Cascadia Mono" w:cs="Cascadia Mono"/>
-          <w:color w:val="000000"/>
-          <w:sz w:val="19"/>
-          <w:szCs w:val="19"/>
-          <w:lang w:val="en-CA"/>
-        </w:rPr>
-        <w:t>"</w:t>
-      </w:r>
-      <w:proofErr w:type="spellStart"/>
-      <w:r>
-        <w:rPr>
-          <w:rFonts w:ascii="Cascadia Mono" w:hAnsi="Cascadia Mono" w:cs="Cascadia Mono"/>
-          <w:color w:val="000000"/>
-          <w:sz w:val="19"/>
-          <w:szCs w:val="19"/>
-          <w:lang w:val="en-CA"/>
-        </w:rPr>
-        <w:t>Upsert</w:t>
-      </w:r>
-      <w:proofErr w:type="spellEnd"/>
-      <w:r>
-        <w:rPr>
-          <w:rFonts w:ascii="Cascadia Mono" w:hAnsi="Cascadia Mono" w:cs="Cascadia Mono"/>
-          <w:color w:val="000000"/>
-          <w:sz w:val="19"/>
-          <w:szCs w:val="19"/>
-          <w:lang w:val="en-CA"/>
-        </w:rPr>
-        <w:t>"</w:t>
+        <w:t>&lt;/</w:t>
+      </w:r>
+      <w:r>
+        <w:rPr>
+          <w:rFonts w:ascii="Cascadia Mono" w:hAnsi="Cascadia Mono" w:cs="Cascadia Mono"/>
+          <w:color w:val="800000"/>
+          <w:sz w:val="19"/>
+          <w:szCs w:val="19"/>
+          <w:lang w:val="en-CA"/>
+        </w:rPr>
+        <w:t>a</w:t>
       </w:r>
       <w:r>
         <w:rPr>
@@ -2680,196 +2290,6 @@
         </w:rPr>
         <w:t>&gt;</w:t>
       </w:r>
-      <w:r>
-        <w:rPr>
-          <w:rFonts w:ascii="Cascadia Mono" w:hAnsi="Cascadia Mono" w:cs="Cascadia Mono"/>
-          <w:color w:val="0000FF"/>
-          <w:sz w:val="19"/>
-          <w:szCs w:val="19"/>
-          <w:highlight w:val="green"/>
-          <w:lang w:val="en-CA"/>
-        </w:rPr>
-        <w:t>&lt;</w:t>
-      </w:r>
-      <w:proofErr w:type="spellStart"/>
-      <w:r>
-        <w:rPr>
-          <w:rFonts w:ascii="Cascadia Mono" w:hAnsi="Cascadia Mono" w:cs="Cascadia Mono"/>
-          <w:color w:val="800000"/>
-          <w:sz w:val="19"/>
-          <w:szCs w:val="19"/>
-          <w:highlight w:val="green"/>
-          <w:lang w:val="en-CA"/>
-        </w:rPr>
-        <w:t>i</w:t>
-      </w:r>
-      <w:proofErr w:type="spellEnd"/>
-      <w:r>
-        <w:rPr>
-          <w:rFonts w:ascii="Cascadia Mono" w:hAnsi="Cascadia Mono" w:cs="Cascadia Mono"/>
-          <w:color w:val="000000"/>
-          <w:sz w:val="19"/>
-          <w:szCs w:val="19"/>
-          <w:highlight w:val="green"/>
-          <w:lang w:val="en-CA"/>
-        </w:rPr>
-        <w:t xml:space="preserve"> class</w:t>
-      </w:r>
-      <w:r>
-        <w:rPr>
-          <w:rFonts w:ascii="Cascadia Mono" w:hAnsi="Cascadia Mono" w:cs="Cascadia Mono"/>
-          <w:color w:val="0000FF"/>
-          <w:sz w:val="19"/>
-          <w:szCs w:val="19"/>
-          <w:highlight w:val="green"/>
-          <w:lang w:val="en-CA"/>
-        </w:rPr>
-        <w:t>=</w:t>
-      </w:r>
-      <w:r>
-        <w:rPr>
-          <w:rFonts w:ascii="Cascadia Mono" w:hAnsi="Cascadia Mono" w:cs="Cascadia Mono"/>
-          <w:color w:val="000000"/>
-          <w:sz w:val="19"/>
-          <w:szCs w:val="19"/>
-          <w:highlight w:val="green"/>
-          <w:lang w:val="en-CA"/>
-        </w:rPr>
-        <w:t>"</w:t>
-      </w:r>
-      <w:proofErr w:type="spellStart"/>
-      <w:r>
-        <w:rPr>
-          <w:rFonts w:ascii="Cascadia Mono" w:hAnsi="Cascadia Mono" w:cs="Cascadia Mono"/>
-          <w:color w:val="000000"/>
-          <w:sz w:val="19"/>
-          <w:szCs w:val="19"/>
-          <w:highlight w:val="green"/>
-          <w:lang w:val="en-CA"/>
-        </w:rPr>
-        <w:t>fas</w:t>
-      </w:r>
-      <w:proofErr w:type="spellEnd"/>
-      <w:r>
-        <w:rPr>
-          <w:rFonts w:ascii="Cascadia Mono" w:hAnsi="Cascadia Mono" w:cs="Cascadia Mono"/>
-          <w:color w:val="000000"/>
-          <w:sz w:val="19"/>
-          <w:szCs w:val="19"/>
-          <w:highlight w:val="green"/>
-          <w:lang w:val="en-CA"/>
-        </w:rPr>
-        <w:t xml:space="preserve"> fa-plus-square"</w:t>
-      </w:r>
-      <w:r>
-        <w:rPr>
-          <w:rFonts w:ascii="Cascadia Mono" w:hAnsi="Cascadia Mono" w:cs="Cascadia Mono"/>
-          <w:color w:val="0000FF"/>
-          <w:sz w:val="19"/>
-          <w:szCs w:val="19"/>
-          <w:highlight w:val="green"/>
-          <w:lang w:val="en-CA"/>
-        </w:rPr>
-        <w:t>&gt;&lt;/</w:t>
-      </w:r>
-      <w:proofErr w:type="spellStart"/>
-      <w:r>
-        <w:rPr>
-          <w:rFonts w:ascii="Cascadia Mono" w:hAnsi="Cascadia Mono" w:cs="Cascadia Mono"/>
-          <w:color w:val="800000"/>
-          <w:sz w:val="19"/>
-          <w:szCs w:val="19"/>
-          <w:highlight w:val="green"/>
-          <w:lang w:val="en-CA"/>
-        </w:rPr>
-        <w:t>i</w:t>
-      </w:r>
-      <w:proofErr w:type="spellEnd"/>
-      <w:r>
-        <w:rPr>
-          <w:rFonts w:ascii="Cascadia Mono" w:hAnsi="Cascadia Mono" w:cs="Cascadia Mono"/>
-          <w:color w:val="0000FF"/>
-          <w:sz w:val="19"/>
-          <w:szCs w:val="19"/>
-          <w:highlight w:val="green"/>
-          <w:lang w:val="en-CA"/>
-        </w:rPr>
-        <w:t>&gt;</w:t>
-      </w:r>
-      <w:r>
-        <w:rPr>
-          <w:rFonts w:ascii="Cascadia Mono" w:hAnsi="Cascadia Mono" w:cs="Cascadia Mono"/>
-          <w:color w:val="000000"/>
-          <w:sz w:val="19"/>
-          <w:szCs w:val="19"/>
-          <w:highlight w:val="green"/>
-          <w:lang w:val="en-CA"/>
-        </w:rPr>
-        <w:t>&amp;</w:t>
-      </w:r>
-      <w:proofErr w:type="spellStart"/>
-      <w:r>
-        <w:rPr>
-          <w:rFonts w:ascii="Cascadia Mono" w:hAnsi="Cascadia Mono" w:cs="Cascadia Mono"/>
-          <w:color w:val="000000"/>
-          <w:sz w:val="19"/>
-          <w:szCs w:val="19"/>
-          <w:highlight w:val="green"/>
-          <w:lang w:val="en-CA"/>
-        </w:rPr>
-        <w:t>nbsp;</w:t>
-      </w:r>
-      <w:r>
-        <w:rPr>
-          <w:rFonts w:ascii="Cascadia Mono" w:hAnsi="Cascadia Mono" w:cs="Cascadia Mono"/>
-          <w:color w:val="000000"/>
-          <w:sz w:val="19"/>
-          <w:szCs w:val="19"/>
-          <w:lang w:val="en-CA"/>
-        </w:rPr>
-        <w:t>Create</w:t>
-      </w:r>
-      <w:proofErr w:type="spellEnd"/>
-      <w:r>
-        <w:rPr>
-          <w:rFonts w:ascii="Cascadia Mono" w:hAnsi="Cascadia Mono" w:cs="Cascadia Mono"/>
-          <w:color w:val="000000"/>
-          <w:sz w:val="19"/>
-          <w:szCs w:val="19"/>
-          <w:lang w:val="en-CA"/>
-        </w:rPr>
-        <w:t xml:space="preserve"> New</w:t>
-      </w:r>
-      <w:r>
-        <w:rPr>
-          <w:rFonts w:ascii="Cascadia Mono" w:hAnsi="Cascadia Mono" w:cs="Cascadia Mono"/>
-          <w:color w:val="0000FF"/>
-          <w:sz w:val="19"/>
-          <w:szCs w:val="19"/>
-          <w:lang w:val="en-CA"/>
-        </w:rPr>
-        <w:t>&lt;/</w:t>
-      </w:r>
-      <w:r>
-        <w:rPr>
-          <w:rFonts w:ascii="Cascadia Mono" w:hAnsi="Cascadia Mono" w:cs="Cascadia Mono"/>
-          <w:color w:val="800000"/>
-          <w:sz w:val="19"/>
-          <w:szCs w:val="19"/>
-          <w:lang w:val="en-CA"/>
-        </w:rPr>
-        <w:t>a</w:t>
-      </w:r>
-      <w:r>
-        <w:rPr>
-          <w:rFonts w:ascii="Cascadia Mono" w:hAnsi="Cascadia Mono" w:cs="Cascadia Mono"/>
-          <w:color w:val="0000FF"/>
-          <w:sz w:val="19"/>
-          <w:szCs w:val="19"/>
-          <w:lang w:val="en-CA"/>
-        </w:rPr>
-        <w:t>&gt;</w:t>
-      </w:r>
     </w:p>
     <w:p>
       <w:pPr>
@@ -2912,23 +2332,7 @@
           <w:b/>
           <w:bCs/>
         </w:rPr>
-        <w:t xml:space="preserve"> de type </w:t>
-      </w:r>
-      <w:proofErr w:type="spellStart"/>
-      <w:r>
-        <w:rPr>
-          <w:b/>
-          <w:bCs/>
-        </w:rPr>
-        <w:t>Submit</w:t>
-      </w:r>
-      <w:proofErr w:type="spellEnd"/>
-      <w:r>
-        <w:rPr>
-          <w:b/>
-          <w:bCs/>
-        </w:rPr>
-        <w:t xml:space="preserve"> pour les formulaires</w:t>
+        <w:t xml:space="preserve"> de type Submit pour les formulaires</w:t>
       </w:r>
     </w:p>
     <w:p>
@@ -3023,9 +2427,18 @@
           <w:szCs w:val="19"/>
           <w:lang w:val="en-CA"/>
         </w:rPr>
-        <w:t>"</w:t>
-      </w:r>
-      <w:proofErr w:type="spellStart"/>
+        <w:t>"btn btn-success w-100" value</w:t>
+      </w:r>
+      <w:r>
+        <w:rPr>
+          <w:rFonts w:ascii="Cascadia Mono" w:hAnsi="Cascadia Mono" w:cs="Cascadia Mono"/>
+          <w:color w:val="0000FF"/>
+          <w:sz w:val="19"/>
+          <w:szCs w:val="19"/>
+          <w:lang w:val="en-CA"/>
+        </w:rPr>
+        <w:t>=</w:t>
+      </w:r>
       <w:r>
         <w:rPr>
           <w:rFonts w:ascii="Cascadia Mono" w:hAnsi="Cascadia Mono" w:cs="Cascadia Mono"/>
@@ -3034,40 +2447,7 @@
           <w:szCs w:val="19"/>
           <w:lang w:val="en-CA"/>
         </w:rPr>
-        <w:t>btn</w:t>
-      </w:r>
-      <w:proofErr w:type="spellEnd"/>
-      <w:r>
-        <w:rPr>
-          <w:rFonts w:ascii="Cascadia Mono" w:hAnsi="Cascadia Mono" w:cs="Cascadia Mono"/>
-          <w:color w:val="000000"/>
-          <w:sz w:val="19"/>
-          <w:szCs w:val="19"/>
-          <w:lang w:val="en-CA"/>
-        </w:rPr>
-        <w:t xml:space="preserve"> </w:t>
-      </w:r>
-      <w:proofErr w:type="spellStart"/>
-      <w:r>
-        <w:rPr>
-          <w:rFonts w:ascii="Cascadia Mono" w:hAnsi="Cascadia Mono" w:cs="Cascadia Mono"/>
-          <w:color w:val="000000"/>
-          <w:sz w:val="19"/>
-          <w:szCs w:val="19"/>
-          <w:lang w:val="en-CA"/>
-        </w:rPr>
-        <w:t>btn</w:t>
-      </w:r>
-      <w:proofErr w:type="spellEnd"/>
-      <w:r>
-        <w:rPr>
-          <w:rFonts w:ascii="Cascadia Mono" w:hAnsi="Cascadia Mono" w:cs="Cascadia Mono"/>
-          <w:color w:val="000000"/>
-          <w:sz w:val="19"/>
-          <w:szCs w:val="19"/>
-          <w:lang w:val="en-CA"/>
-        </w:rPr>
-        <w:t>-success w-100" value</w:t>
+        <w:t xml:space="preserve">"Create" </w:t>
       </w:r>
       <w:r>
         <w:rPr>
@@ -3075,26 +2455,6 @@
           <w:color w:val="0000FF"/>
           <w:sz w:val="19"/>
           <w:szCs w:val="19"/>
-          <w:lang w:val="en-CA"/>
-        </w:rPr>
-        <w:t>=</w:t>
-      </w:r>
-      <w:r>
-        <w:rPr>
-          <w:rFonts w:ascii="Cascadia Mono" w:hAnsi="Cascadia Mono" w:cs="Cascadia Mono"/>
-          <w:color w:val="000000"/>
-          <w:sz w:val="19"/>
-          <w:szCs w:val="19"/>
-          <w:lang w:val="en-CA"/>
-        </w:rPr>
-        <w:t xml:space="preserve">"Create" </w:t>
-      </w:r>
-      <w:r>
-        <w:rPr>
-          <w:rFonts w:ascii="Cascadia Mono" w:hAnsi="Cascadia Mono" w:cs="Cascadia Mono"/>
-          <w:color w:val="0000FF"/>
-          <w:sz w:val="19"/>
-          <w:szCs w:val="19"/>
           <w:highlight w:val="cyan"/>
           <w:lang w:val="en-CA"/>
         </w:rPr>
@@ -3111,7 +2471,6 @@
           <w:lang w:val="en-CA"/>
         </w:rPr>
       </w:pPr>
-      <w:proofErr w:type="spellStart"/>
       <w:r>
         <w:rPr>
           <w:b/>
@@ -3119,17 +2478,7 @@
           <w:color w:val="ED7D31" w:themeColor="accent2"/>
           <w:lang w:val="en-CA"/>
         </w:rPr>
-        <w:t>Deviendront</w:t>
-      </w:r>
-      <w:proofErr w:type="spellEnd"/>
-      <w:r>
-        <w:rPr>
-          <w:b/>
-          <w:bCs/>
-          <w:color w:val="ED7D31" w:themeColor="accent2"/>
-          <w:lang w:val="en-CA"/>
-        </w:rPr>
-        <w:t xml:space="preserve"> </w:t>
+        <w:t xml:space="preserve">Deviendront </w:t>
       </w:r>
     </w:p>
     <w:p>
@@ -3215,42 +2564,107 @@
           <w:szCs w:val="19"/>
           <w:lang w:val="en-CA"/>
         </w:rPr>
-        <w:t>"</w:t>
-      </w:r>
-      <w:proofErr w:type="spellStart"/>
+        <w:t xml:space="preserve">"btn btn-success w-100" </w:t>
+      </w:r>
+      <w:r>
+        <w:rPr>
+          <w:rFonts w:ascii="Cascadia Mono" w:hAnsi="Cascadia Mono" w:cs="Cascadia Mono"/>
+          <w:color w:val="0000FF"/>
+          <w:sz w:val="19"/>
+          <w:szCs w:val="19"/>
+          <w:highlight w:val="green"/>
+          <w:lang w:val="en-CA"/>
+        </w:rPr>
+        <w:t>&gt;&lt;</w:t>
+      </w:r>
+      <w:r>
+        <w:rPr>
+          <w:rFonts w:ascii="Cascadia Mono" w:hAnsi="Cascadia Mono" w:cs="Cascadia Mono"/>
+          <w:color w:val="800000"/>
+          <w:sz w:val="19"/>
+          <w:szCs w:val="19"/>
+          <w:highlight w:val="green"/>
+          <w:lang w:val="en-CA"/>
+        </w:rPr>
+        <w:t>i</w:t>
+      </w:r>
       <w:r>
         <w:rPr>
           <w:rFonts w:ascii="Cascadia Mono" w:hAnsi="Cascadia Mono" w:cs="Cascadia Mono"/>
           <w:color w:val="000000"/>
           <w:sz w:val="19"/>
           <w:szCs w:val="19"/>
-          <w:lang w:val="en-CA"/>
-        </w:rPr>
-        <w:t>btn</w:t>
-      </w:r>
-      <w:proofErr w:type="spellEnd"/>
+          <w:highlight w:val="green"/>
+          <w:lang w:val="en-CA"/>
+        </w:rPr>
+        <w:t xml:space="preserve"> class</w:t>
+      </w:r>
+      <w:r>
+        <w:rPr>
+          <w:rFonts w:ascii="Cascadia Mono" w:hAnsi="Cascadia Mono" w:cs="Cascadia Mono"/>
+          <w:color w:val="0000FF"/>
+          <w:sz w:val="19"/>
+          <w:szCs w:val="19"/>
+          <w:highlight w:val="green"/>
+          <w:lang w:val="en-CA"/>
+        </w:rPr>
+        <w:t>=</w:t>
+      </w:r>
       <w:r>
         <w:rPr>
           <w:rFonts w:ascii="Cascadia Mono" w:hAnsi="Cascadia Mono" w:cs="Cascadia Mono"/>
           <w:color w:val="000000"/>
           <w:sz w:val="19"/>
           <w:szCs w:val="19"/>
-          <w:lang w:val="en-CA"/>
-        </w:rPr>
-        <w:t xml:space="preserve"> </w:t>
-      </w:r>
-      <w:proofErr w:type="spellStart"/>
+          <w:highlight w:val="green"/>
+          <w:lang w:val="en-CA"/>
+        </w:rPr>
+        <w:t>"fas fa-plus-square"</w:t>
+      </w:r>
+      <w:r>
+        <w:rPr>
+          <w:rFonts w:ascii="Cascadia Mono" w:hAnsi="Cascadia Mono" w:cs="Cascadia Mono"/>
+          <w:color w:val="0000FF"/>
+          <w:sz w:val="19"/>
+          <w:szCs w:val="19"/>
+          <w:highlight w:val="green"/>
+          <w:lang w:val="en-CA"/>
+        </w:rPr>
+        <w:t>&gt;&lt;/</w:t>
+      </w:r>
+      <w:r>
+        <w:rPr>
+          <w:rFonts w:ascii="Cascadia Mono" w:hAnsi="Cascadia Mono" w:cs="Cascadia Mono"/>
+          <w:color w:val="800000"/>
+          <w:sz w:val="19"/>
+          <w:szCs w:val="19"/>
+          <w:highlight w:val="green"/>
+          <w:lang w:val="en-CA"/>
+        </w:rPr>
+        <w:t>i</w:t>
+      </w:r>
+      <w:r>
+        <w:rPr>
+          <w:rFonts w:ascii="Cascadia Mono" w:hAnsi="Cascadia Mono" w:cs="Cascadia Mono"/>
+          <w:color w:val="0000FF"/>
+          <w:sz w:val="19"/>
+          <w:szCs w:val="19"/>
+          <w:highlight w:val="green"/>
+          <w:lang w:val="en-CA"/>
+        </w:rPr>
+        <w:t>&gt;</w:t>
+      </w:r>
       <w:r>
         <w:rPr>
           <w:rFonts w:ascii="Cascadia Mono" w:hAnsi="Cascadia Mono" w:cs="Cascadia Mono"/>
           <w:color w:val="000000"/>
           <w:sz w:val="19"/>
           <w:szCs w:val="19"/>
-          <w:lang w:val="en-CA"/>
-        </w:rPr>
-        <w:t>btn</w:t>
-      </w:r>
-      <w:proofErr w:type="spellEnd"/>
+          <w:highlight w:val="green"/>
+          <w:lang w:val="en-CA"/>
+        </w:rPr>
+        <w:t>&amp;nbsp;</w:t>
+      </w:r>
       <w:r>
         <w:rPr>
           <w:rFonts w:ascii="Cascadia Mono" w:hAnsi="Cascadia Mono" w:cs="Cascadia Mono"/>
@@ -3259,158 +2673,8 @@
           <w:szCs w:val="19"/>
           <w:lang w:val="en-CA"/>
         </w:rPr>
-        <w:t xml:space="preserve">-success w-100" </w:t>
-      </w:r>
-      <w:r>
-        <w:rPr>
-          <w:rFonts w:ascii="Cascadia Mono" w:hAnsi="Cascadia Mono" w:cs="Cascadia Mono"/>
-          <w:color w:val="0000FF"/>
-          <w:sz w:val="19"/>
-          <w:szCs w:val="19"/>
-          <w:highlight w:val="green"/>
-          <w:lang w:val="en-CA"/>
-        </w:rPr>
-        <w:t>&gt;&lt;</w:t>
-      </w:r>
-      <w:proofErr w:type="spellStart"/>
-      <w:r>
-        <w:rPr>
-          <w:rFonts w:ascii="Cascadia Mono" w:hAnsi="Cascadia Mono" w:cs="Cascadia Mono"/>
-          <w:color w:val="800000"/>
-          <w:sz w:val="19"/>
-          <w:szCs w:val="19"/>
-          <w:highlight w:val="green"/>
-          <w:lang w:val="en-CA"/>
-        </w:rPr>
-        <w:t>i</w:t>
-      </w:r>
-      <w:proofErr w:type="spellEnd"/>
-      <w:r>
-        <w:rPr>
-          <w:rFonts w:ascii="Cascadia Mono" w:hAnsi="Cascadia Mono" w:cs="Cascadia Mono"/>
-          <w:color w:val="000000"/>
-          <w:sz w:val="19"/>
-          <w:szCs w:val="19"/>
-          <w:highlight w:val="green"/>
-          <w:lang w:val="en-CA"/>
-        </w:rPr>
-        <w:t xml:space="preserve"> class</w:t>
-      </w:r>
-      <w:r>
-        <w:rPr>
-          <w:rFonts w:ascii="Cascadia Mono" w:hAnsi="Cascadia Mono" w:cs="Cascadia Mono"/>
-          <w:color w:val="0000FF"/>
-          <w:sz w:val="19"/>
-          <w:szCs w:val="19"/>
-          <w:highlight w:val="green"/>
-          <w:lang w:val="en-CA"/>
-        </w:rPr>
-        <w:t>=</w:t>
-      </w:r>
-      <w:r>
-        <w:rPr>
-          <w:rFonts w:ascii="Cascadia Mono" w:hAnsi="Cascadia Mono" w:cs="Cascadia Mono"/>
-          <w:color w:val="000000"/>
-          <w:sz w:val="19"/>
-          <w:szCs w:val="19"/>
-          <w:highlight w:val="green"/>
-          <w:lang w:val="en-CA"/>
-        </w:rPr>
-        <w:t>"</w:t>
-      </w:r>
-      <w:proofErr w:type="spellStart"/>
-      <w:r>
-        <w:rPr>
-          <w:rFonts w:ascii="Cascadia Mono" w:hAnsi="Cascadia Mono" w:cs="Cascadia Mono"/>
-          <w:color w:val="000000"/>
-          <w:sz w:val="19"/>
-          <w:szCs w:val="19"/>
-          <w:highlight w:val="green"/>
-          <w:lang w:val="en-CA"/>
-        </w:rPr>
-        <w:t>fas</w:t>
-      </w:r>
-      <w:proofErr w:type="spellEnd"/>
-      <w:r>
-        <w:rPr>
-          <w:rFonts w:ascii="Cascadia Mono" w:hAnsi="Cascadia Mono" w:cs="Cascadia Mono"/>
-          <w:color w:val="000000"/>
-          <w:sz w:val="19"/>
-          <w:szCs w:val="19"/>
-          <w:highlight w:val="green"/>
-          <w:lang w:val="en-CA"/>
-        </w:rPr>
-        <w:t xml:space="preserve"> fa-plus-square"</w:t>
-      </w:r>
-      <w:r>
-        <w:rPr>
-          <w:rFonts w:ascii="Cascadia Mono" w:hAnsi="Cascadia Mono" w:cs="Cascadia Mono"/>
-          <w:color w:val="0000FF"/>
-          <w:sz w:val="19"/>
-          <w:szCs w:val="19"/>
-          <w:highlight w:val="green"/>
-          <w:lang w:val="en-CA"/>
-        </w:rPr>
-        <w:t>&gt;&lt;/</w:t>
-      </w:r>
-      <w:proofErr w:type="spellStart"/>
-      <w:r>
-        <w:rPr>
-          <w:rFonts w:ascii="Cascadia Mono" w:hAnsi="Cascadia Mono" w:cs="Cascadia Mono"/>
-          <w:color w:val="800000"/>
-          <w:sz w:val="19"/>
-          <w:szCs w:val="19"/>
-          <w:highlight w:val="green"/>
-          <w:lang w:val="en-CA"/>
-        </w:rPr>
-        <w:t>i</w:t>
-      </w:r>
-      <w:proofErr w:type="spellEnd"/>
-      <w:r>
-        <w:rPr>
-          <w:rFonts w:ascii="Cascadia Mono" w:hAnsi="Cascadia Mono" w:cs="Cascadia Mono"/>
-          <w:color w:val="0000FF"/>
-          <w:sz w:val="19"/>
-          <w:szCs w:val="19"/>
-          <w:highlight w:val="green"/>
-          <w:lang w:val="en-CA"/>
-        </w:rPr>
-        <w:t>&gt;</w:t>
-      </w:r>
-      <w:r>
-        <w:rPr>
-          <w:rFonts w:ascii="Cascadia Mono" w:hAnsi="Cascadia Mono" w:cs="Cascadia Mono"/>
-          <w:color w:val="000000"/>
-          <w:sz w:val="19"/>
-          <w:szCs w:val="19"/>
-          <w:highlight w:val="green"/>
-          <w:lang w:val="en-CA"/>
-        </w:rPr>
-        <w:t>&amp;</w:t>
-      </w:r>
-      <w:proofErr w:type="spellStart"/>
-      <w:r>
-        <w:rPr>
-          <w:rFonts w:ascii="Cascadia Mono" w:hAnsi="Cascadia Mono" w:cs="Cascadia Mono"/>
-          <w:color w:val="000000"/>
-          <w:sz w:val="19"/>
-          <w:szCs w:val="19"/>
-          <w:highlight w:val="green"/>
-          <w:lang w:val="en-CA"/>
-        </w:rPr>
-        <w:t>nbsp;</w:t>
-      </w:r>
-      <w:r>
-        <w:rPr>
-          <w:rFonts w:ascii="Cascadia Mono" w:hAnsi="Cascadia Mono" w:cs="Cascadia Mono"/>
-          <w:color w:val="000000"/>
-          <w:sz w:val="19"/>
-          <w:szCs w:val="19"/>
-          <w:lang w:val="en-CA"/>
-        </w:rPr>
         <w:t>Create</w:t>
       </w:r>
-      <w:proofErr w:type="spellEnd"/>
       <w:r>
         <w:rPr>
           <w:rFonts w:ascii="Cascadia Mono" w:hAnsi="Cascadia Mono" w:cs="Cascadia Mono"/>
@@ -3549,29 +2813,7 @@
           <w:szCs w:val="19"/>
           <w:lang w:val="en-CA"/>
         </w:rPr>
-        <w:t>"</w:t>
-      </w:r>
-      <w:proofErr w:type="spellStart"/>
-      <w:r>
-        <w:rPr>
-          <w:rFonts w:ascii="Cascadia Mono" w:hAnsi="Cascadia Mono" w:cs="Cascadia Mono"/>
-          <w:color w:val="A31515"/>
-          <w:sz w:val="19"/>
-          <w:szCs w:val="19"/>
-          <w:lang w:val="en-CA"/>
-        </w:rPr>
-        <w:t>Upsert</w:t>
-      </w:r>
-      <w:proofErr w:type="spellEnd"/>
-      <w:r>
-        <w:rPr>
-          <w:rFonts w:ascii="Cascadia Mono" w:hAnsi="Cascadia Mono" w:cs="Cascadia Mono"/>
-          <w:color w:val="A31515"/>
-          <w:sz w:val="19"/>
-          <w:szCs w:val="19"/>
-          <w:lang w:val="en-CA"/>
-        </w:rPr>
-        <w:t>"</w:t>
+        <w:t>"Upsert"</w:t>
       </w:r>
       <w:r>
         <w:rPr>
@@ -3601,29 +2843,7 @@
           <w:szCs w:val="19"/>
           <w:lang w:val="en-CA"/>
         </w:rPr>
-        <w:t xml:space="preserve"> { id=</w:t>
-      </w:r>
-      <w:proofErr w:type="spellStart"/>
-      <w:r>
-        <w:rPr>
-          <w:rFonts w:ascii="Cascadia Mono" w:hAnsi="Cascadia Mono" w:cs="Cascadia Mono"/>
-          <w:color w:val="000000"/>
-          <w:sz w:val="19"/>
-          <w:szCs w:val="19"/>
-          <w:lang w:val="en-CA"/>
-        </w:rPr>
-        <w:t>item.WeaponId</w:t>
-      </w:r>
-      <w:proofErr w:type="spellEnd"/>
-      <w:r>
-        <w:rPr>
-          <w:rFonts w:ascii="Cascadia Mono" w:hAnsi="Cascadia Mono" w:cs="Cascadia Mono"/>
-          <w:color w:val="000000"/>
-          <w:sz w:val="19"/>
-          <w:szCs w:val="19"/>
-          <w:lang w:val="en-CA"/>
-        </w:rPr>
-        <w:t xml:space="preserve"> }) |</w:t>
+        <w:t xml:space="preserve"> { id=item.WeaponId }) |</w:t>
       </w:r>
     </w:p>
     <w:p>
@@ -3636,7 +2856,6 @@
           <w:lang w:val="en-CA"/>
         </w:rPr>
       </w:pPr>
-      <w:proofErr w:type="spellStart"/>
       <w:r>
         <w:rPr>
           <w:b/>
@@ -3644,17 +2863,7 @@
           <w:color w:val="ED7D31" w:themeColor="accent2"/>
           <w:lang w:val="en-CA"/>
         </w:rPr>
-        <w:t>Deviendront</w:t>
-      </w:r>
-      <w:proofErr w:type="spellEnd"/>
-      <w:r>
-        <w:rPr>
-          <w:b/>
-          <w:bCs/>
-          <w:color w:val="ED7D31" w:themeColor="accent2"/>
-          <w:lang w:val="en-CA"/>
-        </w:rPr>
-        <w:t xml:space="preserve"> </w:t>
+        <w:t xml:space="preserve">Deviendront </w:t>
       </w:r>
     </w:p>
     <w:p>
@@ -3719,9 +2928,8 @@
           <w:szCs w:val="19"/>
           <w:lang w:val="en-CA"/>
         </w:rPr>
-        <w:t>"</w:t>
-      </w:r>
-      <w:proofErr w:type="spellStart"/>
+        <w:t>"U</w:t>
+      </w:r>
       <w:r>
         <w:rPr>
           <w:rFonts w:ascii="Cascadia Mono" w:hAnsi="Cascadia Mono" w:cs="Cascadia Mono"/>
@@ -3730,7 +2938,7 @@
           <w:szCs w:val="19"/>
           <w:lang w:val="en-CA"/>
         </w:rPr>
-        <w:t>U</w:t>
+        <w:t>ps</w:t>
       </w:r>
       <w:r>
         <w:rPr>
@@ -3740,7 +2948,17 @@
           <w:szCs w:val="19"/>
           <w:lang w:val="en-CA"/>
         </w:rPr>
-        <w:t>ps</w:t>
+        <w:t>ert" asp-route-Id</w:t>
+      </w:r>
+      <w:r>
+        <w:rPr>
+          <w:rFonts w:ascii="Cascadia Mono" w:hAnsi="Cascadia Mono" w:cs="Cascadia Mono"/>
+          <w:color w:val="0000FF"/>
+          <w:sz w:val="19"/>
+          <w:szCs w:val="19"/>
+          <w:lang w:val="en-CA"/>
+        </w:rPr>
+        <w:t>=</w:t>
       </w:r>
       <w:r>
         <w:rPr>
@@ -3750,9 +2968,28 @@
           <w:szCs w:val="19"/>
           <w:lang w:val="en-CA"/>
         </w:rPr>
-        <w:t>ert</w:t>
-      </w:r>
-      <w:proofErr w:type="spellEnd"/>
+        <w:t>"@item.WeaponId"</w:t>
+      </w:r>
+      <w:r>
+        <w:rPr>
+          <w:rFonts w:ascii="Cascadia Mono" w:hAnsi="Cascadia Mono" w:cs="Cascadia Mono"/>
+          <w:color w:val="0000FF"/>
+          <w:sz w:val="19"/>
+          <w:szCs w:val="19"/>
+          <w:lang w:val="en-CA"/>
+        </w:rPr>
+        <w:t>&gt;&lt;</w:t>
+      </w:r>
+      <w:r>
+        <w:rPr>
+          <w:rFonts w:ascii="Cascadia Mono" w:hAnsi="Cascadia Mono" w:cs="Cascadia Mono"/>
+          <w:color w:val="800000"/>
+          <w:sz w:val="19"/>
+          <w:szCs w:val="19"/>
+          <w:lang w:val="en-CA"/>
+        </w:rPr>
+        <w:t>i</w:t>
+      </w:r>
       <w:r>
         <w:rPr>
           <w:rFonts w:ascii="Cascadia Mono" w:hAnsi="Cascadia Mono" w:cs="Cascadia Mono"/>
@@ -3761,7 +2998,7 @@
           <w:szCs w:val="19"/>
           <w:lang w:val="en-CA"/>
         </w:rPr>
-        <w:t>" asp-route-Id</w:t>
+        <w:t xml:space="preserve"> class</w:t>
       </w:r>
       <w:r>
         <w:rPr>
@@ -3781,9 +3018,38 @@
           <w:szCs w:val="19"/>
           <w:lang w:val="en-CA"/>
         </w:rPr>
-        <w:t>"@</w:t>
-      </w:r>
-      <w:proofErr w:type="spellStart"/>
+        <w:t>"fa-solid fa-pen-to-square"</w:t>
+      </w:r>
+      <w:r>
+        <w:rPr>
+          <w:rFonts w:ascii="Cascadia Mono" w:hAnsi="Cascadia Mono" w:cs="Cascadia Mono"/>
+          <w:color w:val="0000FF"/>
+          <w:sz w:val="19"/>
+          <w:szCs w:val="19"/>
+          <w:lang w:val="en-CA"/>
+        </w:rPr>
+        <w:t>&gt;&lt;/</w:t>
+      </w:r>
+      <w:r>
+        <w:rPr>
+          <w:rFonts w:ascii="Cascadia Mono" w:hAnsi="Cascadia Mono" w:cs="Cascadia Mono"/>
+          <w:color w:val="800000"/>
+          <w:sz w:val="19"/>
+          <w:szCs w:val="19"/>
+          <w:lang w:val="en-CA"/>
+        </w:rPr>
+        <w:t>i</w:t>
+      </w:r>
+      <w:r>
+        <w:rPr>
+          <w:rFonts w:ascii="Cascadia Mono" w:hAnsi="Cascadia Mono" w:cs="Cascadia Mono"/>
+          <w:color w:val="0000FF"/>
+          <w:sz w:val="19"/>
+          <w:szCs w:val="19"/>
+          <w:lang w:val="en-CA"/>
+        </w:rPr>
+        <w:t>&gt;</w:t>
+      </w:r>
       <w:r>
         <w:rPr>
           <w:rFonts w:ascii="Cascadia Mono" w:hAnsi="Cascadia Mono" w:cs="Cascadia Mono"/>
@@ -3792,125 +3058,8 @@
           <w:szCs w:val="19"/>
           <w:lang w:val="en-CA"/>
         </w:rPr>
-        <w:t>item.WeaponId</w:t>
-      </w:r>
-      <w:proofErr w:type="spellEnd"/>
-      <w:r>
-        <w:rPr>
-          <w:rFonts w:ascii="Cascadia Mono" w:hAnsi="Cascadia Mono" w:cs="Cascadia Mono"/>
-          <w:color w:val="000000"/>
-          <w:sz w:val="19"/>
-          <w:szCs w:val="19"/>
-          <w:lang w:val="en-CA"/>
-        </w:rPr>
-        <w:t>"</w:t>
-      </w:r>
-      <w:r>
-        <w:rPr>
-          <w:rFonts w:ascii="Cascadia Mono" w:hAnsi="Cascadia Mono" w:cs="Cascadia Mono"/>
-          <w:color w:val="0000FF"/>
-          <w:sz w:val="19"/>
-          <w:szCs w:val="19"/>
-          <w:lang w:val="en-CA"/>
-        </w:rPr>
-        <w:t>&gt;&lt;</w:t>
-      </w:r>
-      <w:proofErr w:type="spellStart"/>
-      <w:r>
-        <w:rPr>
-          <w:rFonts w:ascii="Cascadia Mono" w:hAnsi="Cascadia Mono" w:cs="Cascadia Mono"/>
-          <w:color w:val="800000"/>
-          <w:sz w:val="19"/>
-          <w:szCs w:val="19"/>
-          <w:lang w:val="en-CA"/>
-        </w:rPr>
-        <w:t>i</w:t>
-      </w:r>
-      <w:proofErr w:type="spellEnd"/>
-      <w:r>
-        <w:rPr>
-          <w:rFonts w:ascii="Cascadia Mono" w:hAnsi="Cascadia Mono" w:cs="Cascadia Mono"/>
-          <w:color w:val="000000"/>
-          <w:sz w:val="19"/>
-          <w:szCs w:val="19"/>
-          <w:lang w:val="en-CA"/>
-        </w:rPr>
-        <w:t xml:space="preserve"> class</w:t>
-      </w:r>
-      <w:r>
-        <w:rPr>
-          <w:rFonts w:ascii="Cascadia Mono" w:hAnsi="Cascadia Mono" w:cs="Cascadia Mono"/>
-          <w:color w:val="0000FF"/>
-          <w:sz w:val="19"/>
-          <w:szCs w:val="19"/>
-          <w:lang w:val="en-CA"/>
-        </w:rPr>
-        <w:t>=</w:t>
-      </w:r>
-      <w:r>
-        <w:rPr>
-          <w:rFonts w:ascii="Cascadia Mono" w:hAnsi="Cascadia Mono" w:cs="Cascadia Mono"/>
-          <w:color w:val="000000"/>
-          <w:sz w:val="19"/>
-          <w:szCs w:val="19"/>
-          <w:lang w:val="en-CA"/>
-        </w:rPr>
-        <w:t>"fa-solid fa-pen-to-square"</w:t>
-      </w:r>
-      <w:r>
-        <w:rPr>
-          <w:rFonts w:ascii="Cascadia Mono" w:hAnsi="Cascadia Mono" w:cs="Cascadia Mono"/>
-          <w:color w:val="0000FF"/>
-          <w:sz w:val="19"/>
-          <w:szCs w:val="19"/>
-          <w:lang w:val="en-CA"/>
-        </w:rPr>
-        <w:t>&gt;&lt;/</w:t>
-      </w:r>
-      <w:proofErr w:type="spellStart"/>
-      <w:r>
-        <w:rPr>
-          <w:rFonts w:ascii="Cascadia Mono" w:hAnsi="Cascadia Mono" w:cs="Cascadia Mono"/>
-          <w:color w:val="800000"/>
-          <w:sz w:val="19"/>
-          <w:szCs w:val="19"/>
-          <w:lang w:val="en-CA"/>
-        </w:rPr>
-        <w:t>i</w:t>
-      </w:r>
-      <w:proofErr w:type="spellEnd"/>
-      <w:r>
-        <w:rPr>
-          <w:rFonts w:ascii="Cascadia Mono" w:hAnsi="Cascadia Mono" w:cs="Cascadia Mono"/>
-          <w:color w:val="0000FF"/>
-          <w:sz w:val="19"/>
-          <w:szCs w:val="19"/>
-          <w:lang w:val="en-CA"/>
-        </w:rPr>
-        <w:t>&gt;</w:t>
-      </w:r>
-      <w:r>
-        <w:rPr>
-          <w:rFonts w:ascii="Cascadia Mono" w:hAnsi="Cascadia Mono" w:cs="Cascadia Mono"/>
-          <w:color w:val="000000"/>
-          <w:sz w:val="19"/>
-          <w:szCs w:val="19"/>
-          <w:lang w:val="en-CA"/>
-        </w:rPr>
-        <w:t xml:space="preserve"> &amp;</w:t>
-      </w:r>
-      <w:proofErr w:type="spellStart"/>
-      <w:r>
-        <w:rPr>
-          <w:rFonts w:ascii="Cascadia Mono" w:hAnsi="Cascadia Mono" w:cs="Cascadia Mono"/>
-          <w:color w:val="000000"/>
-          <w:sz w:val="19"/>
-          <w:szCs w:val="19"/>
-          <w:lang w:val="en-CA"/>
-        </w:rPr>
-        <w:t>nbsp;Edit</w:t>
-      </w:r>
-      <w:proofErr w:type="spellEnd"/>
+        <w:t xml:space="preserve"> &amp;nbsp;Edit</w:t>
+      </w:r>
       <w:r>
         <w:rPr>
           <w:rFonts w:ascii="Cascadia Mono" w:hAnsi="Cascadia Mono" w:cs="Cascadia Mono"/>
@@ -4012,17 +3161,8 @@
           <w:b/>
           <w:bCs/>
         </w:rPr>
-        <w:t>_</w:t>
-      </w:r>
-      <w:proofErr w:type="spellStart"/>
-      <w:r>
-        <w:rPr>
-          <w:b/>
-          <w:bCs/>
-        </w:rPr>
-        <w:t>ZombieCard</w:t>
-      </w:r>
-      <w:proofErr w:type="spellEnd"/>
+        <w:t>_ZombieCard</w:t>
+      </w:r>
     </w:p>
     <w:p>
       <w:pPr>
@@ -4038,7 +3178,6 @@
       <w:r>
         <w:t xml:space="preserve">ônes </w:t>
       </w:r>
-      <w:proofErr w:type="spellStart"/>
       <w:r>
         <w:rPr>
           <w:b/>
@@ -4046,7 +3185,6 @@
         </w:rPr>
         <w:t>FontAwesome</w:t>
       </w:r>
-      <w:proofErr w:type="spellEnd"/>
       <w:r>
         <w:t>, c’est le moment de les ajouter!</w:t>
       </w:r>
@@ -4089,23 +3227,7 @@
           <w:b/>
           <w:bCs/>
         </w:rPr>
-        <w:t xml:space="preserve">Show </w:t>
-      </w:r>
-      <w:proofErr w:type="spellStart"/>
-      <w:r>
-        <w:rPr>
-          <w:b/>
-          <w:bCs/>
-        </w:rPr>
-        <w:t>Detail</w:t>
-      </w:r>
-      <w:proofErr w:type="spellEnd"/>
-      <w:r>
-        <w:rPr>
-          <w:b/>
-          <w:bCs/>
-        </w:rPr>
-        <w:t xml:space="preserve"> Card </w:t>
+        <w:t xml:space="preserve">Show Detail Card </w:t>
       </w:r>
       <w:r>
         <w:t xml:space="preserve">qui </w:t>
@@ -4129,30 +3251,17 @@
       <w:r>
         <w:t xml:space="preserve"> les </w:t>
       </w:r>
-      <w:proofErr w:type="spellStart"/>
       <w:r>
         <w:t>T</w:t>
       </w:r>
       <w:r>
-        <w:t>agHelpers</w:t>
-      </w:r>
-      <w:proofErr w:type="spellEnd"/>
-      <w:r>
-        <w:t xml:space="preserve"> manquants et</w:t>
+        <w:t>agHelpers manquants et</w:t>
       </w:r>
       <w:r>
         <w:t xml:space="preserve"> l’icône</w:t>
       </w:r>
       <w:r>
-        <w:t xml:space="preserve"> </w:t>
-      </w:r>
-      <w:proofErr w:type="spellStart"/>
-      <w:r>
-        <w:t>FontAwesome</w:t>
-      </w:r>
-      <w:proofErr w:type="spellEnd"/>
-      <w:r>
-        <w:t>.</w:t>
+        <w:t xml:space="preserve"> FontAwesome.</w:t>
       </w:r>
     </w:p>
     <w:p>
@@ -4221,51 +3330,7 @@
           <w:szCs w:val="19"/>
           <w:lang w:val="en-CA"/>
         </w:rPr>
-        <w:t xml:space="preserve">"p-2 border w-100 </w:t>
-      </w:r>
-      <w:proofErr w:type="spellStart"/>
-      <w:r>
-        <w:rPr>
-          <w:rFonts w:ascii="Cascadia Mono" w:hAnsi="Cascadia Mono" w:cs="Cascadia Mono"/>
-          <w:color w:val="000000"/>
-          <w:sz w:val="19"/>
-          <w:szCs w:val="19"/>
-          <w:lang w:val="en-CA"/>
-        </w:rPr>
-        <w:t>btn</w:t>
-      </w:r>
-      <w:proofErr w:type="spellEnd"/>
-      <w:r>
-        <w:rPr>
-          <w:rFonts w:ascii="Cascadia Mono" w:hAnsi="Cascadia Mono" w:cs="Cascadia Mono"/>
-          <w:color w:val="000000"/>
-          <w:sz w:val="19"/>
-          <w:szCs w:val="19"/>
-          <w:lang w:val="en-CA"/>
-        </w:rPr>
-        <w:t xml:space="preserve"> </w:t>
-      </w:r>
-      <w:proofErr w:type="spellStart"/>
-      <w:r>
-        <w:rPr>
-          <w:rFonts w:ascii="Cascadia Mono" w:hAnsi="Cascadia Mono" w:cs="Cascadia Mono"/>
-          <w:color w:val="000000"/>
-          <w:sz w:val="19"/>
-          <w:szCs w:val="19"/>
-          <w:lang w:val="en-CA"/>
-        </w:rPr>
-        <w:t>btn</w:t>
-      </w:r>
-      <w:proofErr w:type="spellEnd"/>
-      <w:r>
-        <w:rPr>
-          <w:rFonts w:ascii="Cascadia Mono" w:hAnsi="Cascadia Mono" w:cs="Cascadia Mono"/>
-          <w:color w:val="000000"/>
-          <w:sz w:val="19"/>
-          <w:szCs w:val="19"/>
-          <w:lang w:val="en-CA"/>
-        </w:rPr>
-        <w:t xml:space="preserve">-info px-3" </w:t>
+        <w:t xml:space="preserve">"p-2 border w-100 btn btn-info px-3" </w:t>
       </w:r>
       <w:r>
         <w:rPr>
@@ -4362,15 +3427,7 @@
         <w:ind w:left="720"/>
       </w:pPr>
       <w:r>
-        <w:t xml:space="preserve">Oui : </w:t>
-      </w:r>
-      <w:proofErr w:type="spellStart"/>
-      <w:r>
-        <w:t>Yé</w:t>
-      </w:r>
-      <w:proofErr w:type="spellEnd"/>
-      <w:r>
-        <w:t>!</w:t>
+        <w:t>Oui : Yé!</w:t>
       </w:r>
     </w:p>
     <w:p>
@@ -4387,16 +3444,11 @@
       <w:r>
         <w:t xml:space="preserve"> </w:t>
       </w:r>
-      <w:proofErr w:type="spellStart"/>
       <w:r>
         <w:t>l’</w:t>
       </w:r>
       <w:r>
-        <w:t>Id</w:t>
-      </w:r>
-      <w:proofErr w:type="spellEnd"/>
-      <w:r>
-        <w:t xml:space="preserve"> passé en paramètre?</w:t>
+        <w:t>Id passé en paramètre?</w:t>
       </w:r>
       <w:r>
         <w:t xml:space="preserve"> Si nécessaire, un petit coup de pouce ci-dessous…</w:t>
@@ -4447,73 +3499,7 @@
           <w:szCs w:val="19"/>
           <w:lang w:val="en-CA"/>
         </w:rPr>
-        <w:t xml:space="preserve">-2 border w-100 </w:t>
-      </w:r>
-      <w:proofErr w:type="spellStart"/>
-      <w:r>
-        <w:rPr>
-          <w:rFonts w:ascii="Cascadia Mono" w:hAnsi="Cascadia Mono" w:cs="Cascadia Mono"/>
-          <w:color w:val="FFE599" w:themeColor="accent4" w:themeTint="66"/>
-          <w:sz w:val="19"/>
-          <w:szCs w:val="19"/>
-          <w:lang w:val="en-CA"/>
-        </w:rPr>
-        <w:t>btn</w:t>
-      </w:r>
-      <w:proofErr w:type="spellEnd"/>
-      <w:r>
-        <w:rPr>
-          <w:rFonts w:ascii="Cascadia Mono" w:hAnsi="Cascadia Mono" w:cs="Cascadia Mono"/>
-          <w:color w:val="FFE599" w:themeColor="accent4" w:themeTint="66"/>
-          <w:sz w:val="19"/>
-          <w:szCs w:val="19"/>
-          <w:lang w:val="en-CA"/>
-        </w:rPr>
-        <w:t xml:space="preserve"> </w:t>
-      </w:r>
-      <w:proofErr w:type="spellStart"/>
-      <w:r>
-        <w:rPr>
-          <w:rFonts w:ascii="Cascadia Mono" w:hAnsi="Cascadia Mono" w:cs="Cascadia Mono"/>
-          <w:color w:val="FFE599" w:themeColor="accent4" w:themeTint="66"/>
-          <w:sz w:val="19"/>
-          <w:szCs w:val="19"/>
-          <w:lang w:val="en-CA"/>
-        </w:rPr>
-        <w:t>btn</w:t>
-      </w:r>
-      <w:proofErr w:type="spellEnd"/>
-      <w:r>
-        <w:rPr>
-          <w:rFonts w:ascii="Cascadia Mono" w:hAnsi="Cascadia Mono" w:cs="Cascadia Mono"/>
-          <w:color w:val="FFE599" w:themeColor="accent4" w:themeTint="66"/>
-          <w:sz w:val="19"/>
-          <w:szCs w:val="19"/>
-          <w:lang w:val="en-CA"/>
-        </w:rPr>
-        <w:t>-info px-3" asp-action="Edit" asp-route-Id="@</w:t>
-      </w:r>
-      <w:proofErr w:type="spellStart"/>
-      <w:r>
-        <w:rPr>
-          <w:rFonts w:ascii="Cascadia Mono" w:hAnsi="Cascadia Mono" w:cs="Cascadia Mono"/>
-          <w:color w:val="FFE599" w:themeColor="accent4" w:themeTint="66"/>
-          <w:sz w:val="19"/>
-          <w:szCs w:val="19"/>
-          <w:lang w:val="en-CA"/>
-        </w:rPr>
-        <w:t>Model.Id</w:t>
-      </w:r>
-      <w:proofErr w:type="spellEnd"/>
-      <w:r>
-        <w:rPr>
-          <w:rFonts w:ascii="Cascadia Mono" w:hAnsi="Cascadia Mono" w:cs="Cascadia Mono"/>
-          <w:color w:val="FFE599" w:themeColor="accent4" w:themeTint="66"/>
-          <w:sz w:val="19"/>
-          <w:szCs w:val="19"/>
-          <w:lang w:val="en-CA"/>
-        </w:rPr>
-        <w:t>" &gt;</w:t>
+        <w:t>-2 border w-100 btn btn-info px-3" asp-action="Edit" asp-route-Id="@Model.Id" &gt;</w:t>
       </w:r>
     </w:p>
     <w:p>
@@ -4545,64 +3531,8 @@
           <w:szCs w:val="19"/>
           <w:lang w:val="en-CA"/>
         </w:rPr>
-        <w:t xml:space="preserve">    &lt;</w:t>
-      </w:r>
-      <w:proofErr w:type="spellStart"/>
-      <w:r>
-        <w:rPr>
-          <w:rFonts w:ascii="Cascadia Mono" w:hAnsi="Cascadia Mono" w:cs="Cascadia Mono"/>
-          <w:color w:val="FFE599" w:themeColor="accent4" w:themeTint="66"/>
-          <w:sz w:val="19"/>
-          <w:szCs w:val="19"/>
-          <w:lang w:val="en-CA"/>
-        </w:rPr>
-        <w:t>i</w:t>
-      </w:r>
-      <w:proofErr w:type="spellEnd"/>
-      <w:r>
-        <w:rPr>
-          <w:rFonts w:ascii="Cascadia Mono" w:hAnsi="Cascadia Mono" w:cs="Cascadia Mono"/>
-          <w:color w:val="FFE599" w:themeColor="accent4" w:themeTint="66"/>
-          <w:sz w:val="19"/>
-          <w:szCs w:val="19"/>
-          <w:lang w:val="en-CA"/>
-        </w:rPr>
-        <w:t xml:space="preserve"> class="fa-solid fa-pen-to-square"&gt;&lt;/</w:t>
-      </w:r>
-      <w:proofErr w:type="spellStart"/>
-      <w:r>
-        <w:rPr>
-          <w:rFonts w:ascii="Cascadia Mono" w:hAnsi="Cascadia Mono" w:cs="Cascadia Mono"/>
-          <w:color w:val="FFE599" w:themeColor="accent4" w:themeTint="66"/>
-          <w:sz w:val="19"/>
-          <w:szCs w:val="19"/>
-          <w:lang w:val="en-CA"/>
-        </w:rPr>
-        <w:t>i</w:t>
-      </w:r>
-      <w:proofErr w:type="spellEnd"/>
-      <w:r>
-        <w:rPr>
-          <w:rFonts w:ascii="Cascadia Mono" w:hAnsi="Cascadia Mono" w:cs="Cascadia Mono"/>
-          <w:color w:val="FFE599" w:themeColor="accent4" w:themeTint="66"/>
-          <w:sz w:val="19"/>
-          <w:szCs w:val="19"/>
-          <w:lang w:val="en-CA"/>
-        </w:rPr>
-        <w:t>&gt;&amp;</w:t>
-      </w:r>
-      <w:proofErr w:type="spellStart"/>
-      <w:r>
-        <w:rPr>
-          <w:rFonts w:ascii="Cascadia Mono" w:hAnsi="Cascadia Mono" w:cs="Cascadia Mono"/>
-          <w:color w:val="FFE599" w:themeColor="accent4" w:themeTint="66"/>
-          <w:sz w:val="19"/>
-          <w:szCs w:val="19"/>
-          <w:lang w:val="en-CA"/>
-        </w:rPr>
-        <w:t>nbsp;Edit</w:t>
-      </w:r>
-      <w:proofErr w:type="spellEnd"/>
+        <w:t xml:space="preserve">    &lt;i class="fa-solid fa-pen-to-square"&gt;&lt;/i&gt;&amp;nbsp;Edit</w:t>
+      </w:r>
     </w:p>
     <w:p>
       <w:pPr>
@@ -4641,7 +3571,7 @@
           <w:noProof/>
         </w:rPr>
         <w:drawing>
-          <wp:anchor distT="0" distB="0" distL="114300" distR="114300" simplePos="0" relativeHeight="251659264" behindDoc="0" locked="0" layoutInCell="1" allowOverlap="1" wp14:anchorId="5C4060AE" wp14:editId="5AE9AD92">
+          <wp:anchor distT="0" distB="0" distL="114300" distR="114300" simplePos="0" relativeHeight="251659264" behindDoc="0" locked="0" layoutInCell="1" allowOverlap="1" wp14:anchorId="5C4060AE" wp14:editId="7AC4908D">
             <wp:simplePos x="0" y="0"/>
             <wp:positionH relativeFrom="margin">
               <wp:posOffset>5454650</wp:posOffset>
@@ -4789,15 +3719,7 @@
         <w:ind w:firstLine="708"/>
       </w:pPr>
       <w:r>
-        <w:t xml:space="preserve">Oui : </w:t>
-      </w:r>
-      <w:proofErr w:type="spellStart"/>
-      <w:r>
-        <w:t>Yé</w:t>
-      </w:r>
-      <w:proofErr w:type="spellEnd"/>
-      <w:r>
-        <w:t>!</w:t>
+        <w:t>Oui : Yé!</w:t>
       </w:r>
     </w:p>
     <w:p>
@@ -4845,7 +3767,6 @@
           <w:color w:val="FFE599" w:themeColor="accent4" w:themeTint="66"/>
         </w:rPr>
       </w:pPr>
-      <w:proofErr w:type="spellStart"/>
       <w:r>
         <w:rPr>
           <w:rFonts w:ascii="Cascadia Mono" w:hAnsi="Cascadia Mono" w:cs="Cascadia Mono"/>
@@ -4853,17 +3774,7 @@
           <w:sz w:val="19"/>
           <w:szCs w:val="19"/>
         </w:rPr>
-        <w:t>asp-controller</w:t>
-      </w:r>
-      <w:proofErr w:type="spellEnd"/>
-      <w:r>
-        <w:rPr>
-          <w:rFonts w:ascii="Cascadia Mono" w:hAnsi="Cascadia Mono" w:cs="Cascadia Mono"/>
-          <w:color w:val="FFE599" w:themeColor="accent4" w:themeTint="66"/>
-          <w:sz w:val="19"/>
-          <w:szCs w:val="19"/>
-        </w:rPr>
-        <w:t xml:space="preserve">="Zombie" </w:t>
+        <w:t xml:space="preserve">asp-controller="Zombie" </w:t>
       </w:r>
     </w:p>
     <w:p>
@@ -4969,7 +3880,6 @@
         </w:numPr>
         <w:spacing w:before="0" w:after="160" w:line="259" w:lineRule="auto"/>
       </w:pPr>
-      <w:proofErr w:type="spellStart"/>
       <w:r>
         <w:rPr>
           <w:b/>
@@ -4977,32 +3887,18 @@
         </w:rPr>
         <w:t>Summary</w:t>
       </w:r>
-      <w:proofErr w:type="spellEnd"/>
       <w:r>
         <w:t xml:space="preserve">: REFACTOR </w:t>
       </w:r>
       <w:r>
-        <w:t xml:space="preserve">Ajout d’icônes </w:t>
-      </w:r>
-      <w:proofErr w:type="spellStart"/>
-      <w:r>
-        <w:t>FontAwesome</w:t>
-      </w:r>
-      <w:proofErr w:type="spellEnd"/>
-      <w:r>
-        <w:t xml:space="preserve"> boutons</w:t>
+        <w:t>Ajout d’icônes FontAwesome boutons</w:t>
       </w:r>
       <w:r>
         <w:t xml:space="preserve"> et </w:t>
       </w:r>
       <w:r>
-        <w:t>bouton Edit dans _</w:t>
-      </w:r>
-      <w:proofErr w:type="spellStart"/>
-      <w:r>
-        <w:t>ZombieCard</w:t>
-      </w:r>
-      <w:proofErr w:type="spellEnd"/>
+        <w:t>bouton Edit dans _ZombieCard</w:t>
+      </w:r>
     </w:p>
     <w:p>
       <w:pPr>
@@ -5030,24 +3926,14 @@
         <w:t>i</w:t>
       </w:r>
       <w:r>
-        <w:t xml:space="preserve">rie </w:t>
-      </w:r>
-      <w:proofErr w:type="spellStart"/>
-      <w:r>
-        <w:t>FontAwesome</w:t>
-      </w:r>
-      <w:proofErr w:type="spellEnd"/>
+        <w:t>rie FontAwesome</w:t>
+      </w:r>
       <w:r>
         <w:t>, ajout des icônes avec le texte sur les boutons</w:t>
       </w:r>
       <w:r>
-        <w:t xml:space="preserve"> et un bouton Edit dans la vue partielle _</w:t>
-      </w:r>
-      <w:proofErr w:type="spellStart"/>
-      <w:r>
-        <w:t>ZombieCard</w:t>
-      </w:r>
-      <w:proofErr w:type="spellEnd"/>
+        <w:t xml:space="preserve"> et un bouton Edit dans la vue partielle _ZombieCard</w:t>
+      </w:r>
       <w:r>
         <w:t>.</w:t>
       </w:r>
@@ -5097,7 +3983,6 @@
       <w:r>
         <w:t xml:space="preserve"> sur le repo en ligne </w:t>
       </w:r>
-      <w:proofErr w:type="spellStart"/>
       <w:r>
         <w:rPr>
           <w:b/>
@@ -5105,7 +3990,6 @@
         </w:rPr>
         <w:t>Remote</w:t>
       </w:r>
-      <w:proofErr w:type="spellEnd"/>
       <w:r>
         <w:t xml:space="preserve">: cliquez sur </w:t>
       </w:r>
@@ -5207,15 +4091,7 @@
         <w:t>vue</w:t>
       </w:r>
       <w:r>
-        <w:t xml:space="preserve"> </w:t>
-      </w:r>
-      <w:proofErr w:type="spellStart"/>
-      <w:r>
-        <w:t>ZombiesByType.cshtml</w:t>
-      </w:r>
-      <w:proofErr w:type="spellEnd"/>
-      <w:r>
-        <w:t xml:space="preserve"> de ceci</w:t>
+        <w:t xml:space="preserve"> ZombiesByType.cshtml de ceci</w:t>
       </w:r>
       <w:r>
         <w:t> :</w:t>
@@ -5292,13 +4168,8 @@
         <w:t>accordéon</w:t>
       </w:r>
       <w:r>
-        <w:t xml:space="preserve"> </w:t>
-      </w:r>
-      <w:proofErr w:type="spellStart"/>
-      <w:r>
-        <w:t>bootstrap</w:t>
-      </w:r>
-      <w:proofErr w:type="spellEnd"/>
+        <w:t xml:space="preserve"> bootstrap</w:t>
+      </w:r>
       <w:r>
         <w:t> :</w:t>
       </w:r>
@@ -5394,17 +4265,8 @@
           <w:b/>
           <w:bCs/>
         </w:rPr>
-        <w:t>data-bs-</w:t>
-      </w:r>
-      <w:proofErr w:type="spellStart"/>
-      <w:r>
-        <w:rPr>
-          <w:b/>
-          <w:bCs/>
-        </w:rPr>
-        <w:t>target</w:t>
-      </w:r>
-      <w:proofErr w:type="spellEnd"/>
+        <w:t>data-bs-target</w:t>
+      </w:r>
       <w:r>
         <w:t>="</w:t>
       </w:r>
@@ -5425,15 +4287,7 @@
         <w:t>e</w:t>
       </w:r>
       <w:r>
-        <w:t xml:space="preserve"> « </w:t>
-      </w:r>
-      <w:proofErr w:type="spellStart"/>
-      <w:r>
-        <w:t>accordion</w:t>
-      </w:r>
-      <w:proofErr w:type="spellEnd"/>
-      <w:r>
-        <w:t>-collapse collapse ».</w:t>
+        <w:t xml:space="preserve"> « accordion-collapse collapse ».</w:t>
       </w:r>
     </w:p>
     <w:p>
@@ -5444,15 +4298,7 @@
         <w:t>ATTENTION :</w:t>
       </w:r>
       <w:r>
-        <w:t xml:space="preserve">  Si vous utilisez data-bs-</w:t>
-      </w:r>
-      <w:proofErr w:type="spellStart"/>
-      <w:r>
-        <w:t>target</w:t>
-      </w:r>
-      <w:proofErr w:type="spellEnd"/>
-      <w:r>
-        <w:t>=</w:t>
+        <w:t xml:space="preserve">  Si vous utilisez data-bs-target=</w:t>
       </w:r>
       <w:r>
         <w:t>"</w:t>
@@ -5469,17 +4315,8 @@
           <w:b/>
           <w:bCs/>
         </w:rPr>
-        <w:t>@</w:t>
-      </w:r>
-      <w:proofErr w:type="spellStart"/>
-      <w:r>
-        <w:rPr>
-          <w:b/>
-          <w:bCs/>
-        </w:rPr>
-        <w:t>zombieType.Id</w:t>
-      </w:r>
-      <w:proofErr w:type="spellEnd"/>
+        <w:t>@zombieType.Id</w:t>
+      </w:r>
       <w:r>
         <w:t>"</w:t>
       </w:r>
@@ -5494,17 +4331,8 @@
           <w:b/>
           <w:bCs/>
         </w:rPr>
-        <w:t>@</w:t>
-      </w:r>
-      <w:proofErr w:type="spellStart"/>
-      <w:r>
-        <w:rPr>
-          <w:b/>
-          <w:bCs/>
-        </w:rPr>
-        <w:t>zombieType.Id</w:t>
-      </w:r>
-      <w:proofErr w:type="spellEnd"/>
+        <w:t>@zombieType.Id</w:t>
+      </w:r>
       <w:r>
         <w:t>"</w:t>
       </w:r>
@@ -5539,39 +4367,7 @@
           <w:b/>
           <w:bCs/>
         </w:rPr>
-        <w:t>data-bs-</w:t>
-      </w:r>
-      <w:proofErr w:type="spellStart"/>
-      <w:r>
-        <w:rPr>
-          <w:b/>
-          <w:bCs/>
-        </w:rPr>
-        <w:t>target</w:t>
-      </w:r>
-      <w:proofErr w:type="spellEnd"/>
-      <w:r>
-        <w:rPr>
-          <w:b/>
-          <w:bCs/>
-        </w:rPr>
-        <w:t xml:space="preserve">="@("#Id" + </w:t>
-      </w:r>
-      <w:proofErr w:type="spellStart"/>
-      <w:r>
-        <w:rPr>
-          <w:b/>
-          <w:bCs/>
-        </w:rPr>
-        <w:t>zombieType.Id</w:t>
-      </w:r>
-      <w:proofErr w:type="spellEnd"/>
-      <w:r>
-        <w:rPr>
-          <w:b/>
-          <w:bCs/>
-        </w:rPr>
-        <w:t>)"</w:t>
+        <w:t>data-bs-target="@("#Id" + zombieType.Id)"</w:t>
       </w:r>
       <w:r>
         <w:t xml:space="preserve"> et </w:t>
@@ -5581,23 +4377,7 @@
           <w:b/>
           <w:bCs/>
         </w:rPr>
-        <w:t xml:space="preserve">id="@("Id" + </w:t>
-      </w:r>
-      <w:proofErr w:type="spellStart"/>
-      <w:r>
-        <w:rPr>
-          <w:b/>
-          <w:bCs/>
-        </w:rPr>
-        <w:t>zombieType.Id</w:t>
-      </w:r>
-      <w:proofErr w:type="spellEnd"/>
-      <w:r>
-        <w:rPr>
-          <w:b/>
-          <w:bCs/>
-        </w:rPr>
-        <w:t>)"</w:t>
+        <w:t>id="@("Id" + zombieType.Id)"</w:t>
       </w:r>
     </w:p>
     <w:p>
@@ -5621,49 +4401,49 @@
           <w:sz w:val="18"/>
           <w:szCs w:val="18"/>
         </w:rPr>
-        <w:t xml:space="preserve">@model </w:t>
-      </w:r>
-      <w:proofErr w:type="spellStart"/>
-      <w:r>
+        <w:t>@model IEnumerable&lt;ZombieType&gt;</w:t>
+      </w:r>
+    </w:p>
+    <w:p>
+      <w:pPr>
+        <w:pStyle w:val="CodeInvisible"/>
         <w:rPr>
           <w:sz w:val="18"/>
           <w:szCs w:val="18"/>
         </w:rPr>
-        <w:t>IEnumerable</w:t>
-      </w:r>
-      <w:proofErr w:type="spellEnd"/>
-      <w:r>
+      </w:pPr>
+    </w:p>
+    <w:p>
+      <w:pPr>
+        <w:pStyle w:val="CodeInvisible"/>
         <w:rPr>
           <w:sz w:val="18"/>
           <w:szCs w:val="18"/>
         </w:rPr>
-        <w:t>&lt;</w:t>
-      </w:r>
-      <w:proofErr w:type="spellStart"/>
+      </w:pPr>
       <w:r>
         <w:rPr>
           <w:sz w:val="18"/>
           <w:szCs w:val="18"/>
         </w:rPr>
-        <w:t>ZombieType</w:t>
-      </w:r>
-      <w:proofErr w:type="spellEnd"/>
-      <w:r>
+        <w:t>&lt;div class="container p-3"&gt;</w:t>
+      </w:r>
+    </w:p>
+    <w:p>
+      <w:pPr>
+        <w:pStyle w:val="CodeInvisible"/>
         <w:rPr>
           <w:sz w:val="18"/>
           <w:szCs w:val="18"/>
         </w:rPr>
-        <w:t>&gt;</w:t>
-      </w:r>
-    </w:p>
-    <w:p>
-      <w:pPr>
-        <w:pStyle w:val="CodeInvisible"/>
+      </w:pPr>
+      <w:r>
         <w:rPr>
           <w:sz w:val="18"/>
           <w:szCs w:val="18"/>
         </w:rPr>
-      </w:pPr>
+        <w:t xml:space="preserve">    &lt;div class="row pt-4"&gt;</w:t>
+      </w:r>
     </w:p>
     <w:p>
       <w:pPr>
@@ -5678,7 +4458,7 @@
           <w:sz w:val="18"/>
           <w:szCs w:val="18"/>
         </w:rPr>
-        <w:t>&lt;div class="container p-3"&gt;</w:t>
+        <w:t xml:space="preserve">        &lt;div class="col-10"&gt;</w:t>
       </w:r>
     </w:p>
     <w:p>
@@ -5694,7 +4474,7 @@
           <w:sz w:val="18"/>
           <w:szCs w:val="18"/>
         </w:rPr>
-        <w:t xml:space="preserve">    &lt;div class="row pt-4"&gt;</w:t>
+        <w:t xml:space="preserve">            &lt;h2 class="text-primary"&gt;Zombies by type&lt;/h2&gt;</w:t>
       </w:r>
     </w:p>
     <w:p>
@@ -5710,7 +4490,7 @@
           <w:sz w:val="18"/>
           <w:szCs w:val="18"/>
         </w:rPr>
-        <w:t xml:space="preserve">        &lt;div class="col-10"&gt;</w:t>
+        <w:t xml:space="preserve">        &lt;/div&gt;</w:t>
       </w:r>
     </w:p>
     <w:p>
@@ -5726,7 +4506,7 @@
           <w:sz w:val="18"/>
           <w:szCs w:val="18"/>
         </w:rPr>
-        <w:t xml:space="preserve">            &lt;h2 class="text-primary"&gt;Zombies by type&lt;/h2&gt;</w:t>
+        <w:t xml:space="preserve">    &lt;/div&gt;</w:t>
       </w:r>
     </w:p>
     <w:p>
@@ -5737,38 +4517,38 @@
           <w:szCs w:val="18"/>
         </w:rPr>
       </w:pPr>
-      <w:r>
+    </w:p>
+    <w:p>
+      <w:pPr>
+        <w:pStyle w:val="CodeInvisible"/>
         <w:rPr>
           <w:sz w:val="18"/>
           <w:szCs w:val="18"/>
         </w:rPr>
-        <w:t xml:space="preserve">        &lt;/div&gt;</w:t>
-      </w:r>
-    </w:p>
-    <w:p>
-      <w:pPr>
-        <w:pStyle w:val="CodeInvisible"/>
+      </w:pPr>
+      <w:r>
         <w:rPr>
           <w:sz w:val="18"/>
           <w:szCs w:val="18"/>
         </w:rPr>
-      </w:pPr>
-      <w:r>
+        <w:t xml:space="preserve">    &lt;div class="accordion" id="zombieAccordion"&gt;</w:t>
+      </w:r>
+    </w:p>
+    <w:p>
+      <w:pPr>
+        <w:pStyle w:val="CodeInvisible"/>
         <w:rPr>
           <w:sz w:val="18"/>
           <w:szCs w:val="18"/>
         </w:rPr>
-        <w:t xml:space="preserve">    &lt;/div&gt;</w:t>
-      </w:r>
-    </w:p>
-    <w:p>
-      <w:pPr>
-        <w:pStyle w:val="CodeInvisible"/>
+      </w:pPr>
+      <w:r>
         <w:rPr>
           <w:sz w:val="18"/>
           <w:szCs w:val="18"/>
         </w:rPr>
-      </w:pPr>
+        <w:t xml:space="preserve">        @foreach (var zombieType in Model)</w:t>
+      </w:r>
     </w:p>
     <w:p>
       <w:pPr>
@@ -5783,23 +4563,23 @@
           <w:sz w:val="18"/>
           <w:szCs w:val="18"/>
         </w:rPr>
-        <w:t xml:space="preserve">    &lt;div class="accordion" id="</w:t>
-      </w:r>
-      <w:proofErr w:type="spellStart"/>
-      <w:r>
+        <w:t xml:space="preserve">        {</w:t>
+      </w:r>
+    </w:p>
+    <w:p>
+      <w:pPr>
+        <w:pStyle w:val="CodeInvisible"/>
         <w:rPr>
           <w:sz w:val="18"/>
           <w:szCs w:val="18"/>
         </w:rPr>
-        <w:t>zombieAccordion</w:t>
-      </w:r>
-      <w:proofErr w:type="spellEnd"/>
+      </w:pPr>
       <w:r>
         <w:rPr>
           <w:sz w:val="18"/>
           <w:szCs w:val="18"/>
         </w:rPr>
-        <w:t>"&gt;</w:t>
+        <w:t xml:space="preserve">            &lt;div class="accordion-item"&gt;</w:t>
       </w:r>
     </w:p>
     <w:p>
@@ -5815,39 +4595,37 @@
           <w:sz w:val="18"/>
           <w:szCs w:val="18"/>
         </w:rPr>
-        <w:t xml:space="preserve">        @foreach (var </w:t>
-      </w:r>
-      <w:proofErr w:type="spellStart"/>
-      <w:r>
+        <w:t xml:space="preserve">                &lt;h2 class="accordion-header"&gt;</w:t>
+      </w:r>
+    </w:p>
+    <w:p>
+      <w:pPr>
+        <w:pStyle w:val="CodeInvisible"/>
         <w:rPr>
           <w:sz w:val="18"/>
           <w:szCs w:val="18"/>
         </w:rPr>
-        <w:t>zombieType</w:t>
-      </w:r>
-      <w:proofErr w:type="spellEnd"/>
+      </w:pPr>
       <w:r>
         <w:rPr>
           <w:sz w:val="18"/>
           <w:szCs w:val="18"/>
         </w:rPr>
-        <w:t xml:space="preserve"> in Model)</w:t>
-      </w:r>
-    </w:p>
-    <w:p>
-      <w:pPr>
-        <w:pStyle w:val="CodeInvisible"/>
+        <w:t xml:space="preserve">                    &lt;button class="accordion-button collapsed" type="button" data-bs-toggle="collapse" data-bs-target="</w:t>
+      </w:r>
+      <w:r>
         <w:rPr>
           <w:sz w:val="18"/>
           <w:szCs w:val="18"/>
         </w:rPr>
-      </w:pPr>
+        <w:t>@("#Id" + zombieType.Id)</w:t>
+      </w:r>
       <w:r>
         <w:rPr>
           <w:sz w:val="18"/>
           <w:szCs w:val="18"/>
         </w:rPr>
-        <w:t xml:space="preserve">        {</w:t>
+        <w:t>" aria-expanded="false" aria-controls="@zombieType.TypeName"&gt;</w:t>
       </w:r>
     </w:p>
     <w:p>
@@ -5863,7 +4641,7 @@
           <w:sz w:val="18"/>
           <w:szCs w:val="18"/>
         </w:rPr>
-        <w:t xml:space="preserve">            &lt;div class="accordion-item"&gt;</w:t>
+        <w:t xml:space="preserve">                        @zombieType.TypeName</w:t>
       </w:r>
     </w:p>
     <w:p>
@@ -5879,7 +4657,7 @@
           <w:sz w:val="18"/>
           <w:szCs w:val="18"/>
         </w:rPr>
-        <w:t xml:space="preserve">                &lt;h2 class="accordion-header"&gt;</w:t>
+        <w:t xml:space="preserve">                    &lt;/button&gt;</w:t>
       </w:r>
     </w:p>
     <w:p>
@@ -5895,177 +4673,51 @@
           <w:sz w:val="18"/>
           <w:szCs w:val="18"/>
         </w:rPr>
-        <w:t xml:space="preserve">                    &lt;button class="accordion-button collapsed" type="button" data-bs-toggle="collapse" data-bs-target="</w:t>
-      </w:r>
-      <w:r>
+        <w:t xml:space="preserve">                &lt;/h2&gt;</w:t>
+      </w:r>
+    </w:p>
+    <w:p>
+      <w:pPr>
+        <w:pStyle w:val="CodeInvisible"/>
         <w:rPr>
           <w:sz w:val="18"/>
           <w:szCs w:val="18"/>
         </w:rPr>
-        <w:t xml:space="preserve">@("#Id" + </w:t>
-      </w:r>
-      <w:proofErr w:type="spellStart"/>
+      </w:pPr>
       <w:r>
         <w:rPr>
           <w:sz w:val="18"/>
           <w:szCs w:val="18"/>
         </w:rPr>
-        <w:t>zombieType.Id</w:t>
-      </w:r>
-      <w:proofErr w:type="spellEnd"/>
+        <w:t xml:space="preserve">                &lt;div id</w:t>
+      </w:r>
       <w:r>
         <w:rPr>
           <w:sz w:val="18"/>
           <w:szCs w:val="18"/>
         </w:rPr>
-        <w:t>)</w:t>
+        <w:t>=</w:t>
       </w:r>
       <w:r>
         <w:rPr>
           <w:sz w:val="18"/>
           <w:szCs w:val="18"/>
         </w:rPr>
-        <w:t>" aria-expanded="false" aria-controls="@</w:t>
-      </w:r>
-      <w:proofErr w:type="spellStart"/>
+        <w:t>"</w:t>
+      </w:r>
       <w:r>
         <w:rPr>
           <w:sz w:val="18"/>
           <w:szCs w:val="18"/>
         </w:rPr>
-        <w:t>zombieType.TypeName</w:t>
-      </w:r>
-      <w:proofErr w:type="spellEnd"/>
+        <w:t>@("Id" + zombieType.Id)</w:t>
+      </w:r>
       <w:r>
         <w:rPr>
           <w:sz w:val="18"/>
           <w:szCs w:val="18"/>
         </w:rPr>
-        <w:t>"&gt;</w:t>
-      </w:r>
-    </w:p>
-    <w:p>
-      <w:pPr>
-        <w:pStyle w:val="CodeInvisible"/>
-        <w:rPr>
-          <w:sz w:val="18"/>
-          <w:szCs w:val="18"/>
-        </w:rPr>
-      </w:pPr>
-      <w:r>
-        <w:rPr>
-          <w:sz w:val="18"/>
-          <w:szCs w:val="18"/>
-        </w:rPr>
-        <w:t xml:space="preserve">                        @zombieType.TypeName</w:t>
-      </w:r>
-    </w:p>
-    <w:p>
-      <w:pPr>
-        <w:pStyle w:val="CodeInvisible"/>
-        <w:rPr>
-          <w:sz w:val="18"/>
-          <w:szCs w:val="18"/>
-        </w:rPr>
-      </w:pPr>
-      <w:r>
-        <w:rPr>
-          <w:sz w:val="18"/>
-          <w:szCs w:val="18"/>
-        </w:rPr>
-        <w:t xml:space="preserve">                    &lt;/button&gt;</w:t>
-      </w:r>
-    </w:p>
-    <w:p>
-      <w:pPr>
-        <w:pStyle w:val="CodeInvisible"/>
-        <w:rPr>
-          <w:sz w:val="18"/>
-          <w:szCs w:val="18"/>
-        </w:rPr>
-      </w:pPr>
-      <w:r>
-        <w:rPr>
-          <w:sz w:val="18"/>
-          <w:szCs w:val="18"/>
-        </w:rPr>
-        <w:t xml:space="preserve">                &lt;/h2&gt;</w:t>
-      </w:r>
-    </w:p>
-    <w:p>
-      <w:pPr>
-        <w:pStyle w:val="CodeInvisible"/>
-        <w:rPr>
-          <w:sz w:val="18"/>
-          <w:szCs w:val="18"/>
-        </w:rPr>
-      </w:pPr>
-      <w:r>
-        <w:rPr>
-          <w:sz w:val="18"/>
-          <w:szCs w:val="18"/>
-        </w:rPr>
-        <w:t xml:space="preserve">                &lt;div id</w:t>
-      </w:r>
-      <w:r>
-        <w:rPr>
-          <w:sz w:val="18"/>
-          <w:szCs w:val="18"/>
-        </w:rPr>
-        <w:t>=</w:t>
-      </w:r>
-      <w:r>
-        <w:rPr>
-          <w:sz w:val="18"/>
-          <w:szCs w:val="18"/>
-        </w:rPr>
-        <w:t>"</w:t>
-      </w:r>
-      <w:r>
-        <w:rPr>
-          <w:sz w:val="18"/>
-          <w:szCs w:val="18"/>
-        </w:rPr>
-        <w:t xml:space="preserve">@("Id" + </w:t>
-      </w:r>
-      <w:proofErr w:type="spellStart"/>
-      <w:r>
-        <w:rPr>
-          <w:sz w:val="18"/>
-          <w:szCs w:val="18"/>
-        </w:rPr>
-        <w:t>zombieType.Id</w:t>
-      </w:r>
-      <w:proofErr w:type="spellEnd"/>
-      <w:r>
-        <w:rPr>
-          <w:sz w:val="18"/>
-          <w:szCs w:val="18"/>
-        </w:rPr>
-        <w:t>)</w:t>
-      </w:r>
-      <w:r>
-        <w:rPr>
-          <w:sz w:val="18"/>
-          <w:szCs w:val="18"/>
-        </w:rPr>
-        <w:t>" class="accordion-collapse collapse" data-bs-parent="#</w:t>
-      </w:r>
-      <w:proofErr w:type="spellStart"/>
-      <w:r>
-        <w:rPr>
-          <w:sz w:val="18"/>
-          <w:szCs w:val="18"/>
-        </w:rPr>
-        <w:t>zombieAccordion</w:t>
-      </w:r>
-      <w:proofErr w:type="spellEnd"/>
-      <w:r>
-        <w:rPr>
-          <w:sz w:val="18"/>
-          <w:szCs w:val="18"/>
-        </w:rPr>
-        <w:t>"&gt;</w:t>
+        <w:t>" class="accordion-collapse collapse" data-bs-parent="#zombieAccordion"&gt;</w:t>
       </w:r>
     </w:p>
     <w:p>
@@ -6122,257 +4774,184 @@
           <w:szCs w:val="18"/>
           <w:lang w:val="fr-CA"/>
         </w:rPr>
-        <w:t xml:space="preserve">@foreach (var zombie in </w:t>
-      </w:r>
-      <w:proofErr w:type="spellStart"/>
+        <w:t>@foreach (var zombie in zombieType.Zombies)</w:t>
+      </w:r>
+    </w:p>
+    <w:p>
+      <w:pPr>
+        <w:pStyle w:val="CodeInvisible"/>
+        <w:rPr>
+          <w:sz w:val="18"/>
+          <w:szCs w:val="18"/>
+        </w:rPr>
+      </w:pPr>
       <w:r>
         <w:rPr>
           <w:sz w:val="18"/>
           <w:szCs w:val="18"/>
           <w:lang w:val="fr-CA"/>
         </w:rPr>
-        <w:t>zombieType.Zombies</w:t>
-      </w:r>
-      <w:proofErr w:type="spellEnd"/>
-      <w:r>
+        <w:t xml:space="preserve">                            </w:t>
+      </w:r>
+      <w:r>
+        <w:rPr>
+          <w:sz w:val="18"/>
+          <w:szCs w:val="18"/>
+        </w:rPr>
+        <w:t>{</w:t>
+      </w:r>
+    </w:p>
+    <w:p>
+      <w:pPr>
+        <w:pStyle w:val="CodeInvisible"/>
+        <w:rPr>
+          <w:sz w:val="18"/>
+          <w:szCs w:val="18"/>
+        </w:rPr>
+      </w:pPr>
+      <w:r>
+        <w:rPr>
+          <w:sz w:val="18"/>
+          <w:szCs w:val="18"/>
+        </w:rPr>
+        <w:t xml:space="preserve">                                &lt;div href="#" class="card  border m-3 text-center bg-warning" style="width: 20rem; background-image: url('/images/imagesLayout/Fond.png'); "&gt;</w:t>
+      </w:r>
+    </w:p>
+    <w:p>
+      <w:pPr>
+        <w:pStyle w:val="CodeInvisible"/>
+        <w:rPr>
+          <w:sz w:val="18"/>
+          <w:szCs w:val="18"/>
+        </w:rPr>
+      </w:pPr>
+      <w:r>
+        <w:rPr>
+          <w:sz w:val="18"/>
+          <w:szCs w:val="18"/>
+        </w:rPr>
+        <w:t xml:space="preserve">                                    &lt;div class="card-body  text-warning"&gt;</w:t>
+      </w:r>
+    </w:p>
+    <w:p>
+      <w:pPr>
+        <w:pStyle w:val="CodeInvisible"/>
+        <w:rPr>
+          <w:sz w:val="18"/>
+          <w:szCs w:val="18"/>
+        </w:rPr>
+      </w:pPr>
+      <w:r>
+        <w:rPr>
+          <w:sz w:val="18"/>
+          <w:szCs w:val="18"/>
+        </w:rPr>
+        <w:t xml:space="preserve">                                        &lt;h3 class="card-title"&gt; @zombie.Name &lt;/h3&gt;</w:t>
+      </w:r>
+    </w:p>
+    <w:p>
+      <w:pPr>
+        <w:pStyle w:val="CodeInvisible"/>
+        <w:rPr>
+          <w:sz w:val="18"/>
+          <w:szCs w:val="18"/>
+        </w:rPr>
+      </w:pPr>
+      <w:r>
+        <w:rPr>
+          <w:sz w:val="18"/>
+          <w:szCs w:val="18"/>
+        </w:rPr>
+        <w:t xml:space="preserve">                                        &lt;h5&gt; Points: @zombie.Point &lt;/h5&gt;</w:t>
+      </w:r>
+    </w:p>
+    <w:p>
+      <w:pPr>
+        <w:pStyle w:val="CodeInvisible"/>
+        <w:rPr>
+          <w:sz w:val="18"/>
+          <w:szCs w:val="18"/>
+        </w:rPr>
+      </w:pPr>
+      <w:r>
+        <w:rPr>
+          <w:sz w:val="18"/>
+          <w:szCs w:val="18"/>
+        </w:rPr>
+        <w:t xml:space="preserve">                                    &lt;/div&gt;</w:t>
+      </w:r>
+    </w:p>
+    <w:p>
+      <w:pPr>
+        <w:pStyle w:val="CodeInvisible"/>
+        <w:rPr>
+          <w:sz w:val="18"/>
+          <w:szCs w:val="18"/>
+        </w:rPr>
+      </w:pPr>
+      <w:r>
+        <w:rPr>
+          <w:sz w:val="18"/>
+          <w:szCs w:val="18"/>
+        </w:rPr>
+        <w:t xml:space="preserve">                                &lt;/div&gt;</w:t>
+      </w:r>
+    </w:p>
+    <w:p>
+      <w:pPr>
+        <w:pStyle w:val="CodeInvisible"/>
+        <w:rPr>
+          <w:sz w:val="18"/>
+          <w:szCs w:val="18"/>
+        </w:rPr>
+      </w:pPr>
+      <w:r>
+        <w:rPr>
+          <w:sz w:val="18"/>
+          <w:szCs w:val="18"/>
+        </w:rPr>
+        <w:t xml:space="preserve">                            }</w:t>
+      </w:r>
+    </w:p>
+    <w:p>
+      <w:pPr>
+        <w:pStyle w:val="CodeInvisible"/>
+        <w:rPr>
+          <w:sz w:val="18"/>
+          <w:szCs w:val="18"/>
+        </w:rPr>
+      </w:pPr>
+      <w:r>
+        <w:rPr>
+          <w:sz w:val="18"/>
+          <w:szCs w:val="18"/>
+        </w:rPr>
+        <w:t xml:space="preserve">                            @if (zombieType.Zombies.Count == 0)</w:t>
+      </w:r>
+    </w:p>
+    <w:p>
+      <w:pPr>
+        <w:pStyle w:val="CodeInvisible"/>
         <w:rPr>
           <w:sz w:val="18"/>
           <w:szCs w:val="18"/>
           <w:lang w:val="fr-CA"/>
         </w:rPr>
-        <w:t>)</w:t>
-      </w:r>
-    </w:p>
-    <w:p>
-      <w:pPr>
-        <w:pStyle w:val="CodeInvisible"/>
+      </w:pPr>
+      <w:r>
         <w:rPr>
           <w:sz w:val="18"/>
           <w:szCs w:val="18"/>
         </w:rPr>
-      </w:pPr>
+        <w:t xml:space="preserve">                            </w:t>
+      </w:r>
       <w:r>
         <w:rPr>
           <w:sz w:val="18"/>
           <w:szCs w:val="18"/>
           <w:lang w:val="fr-CA"/>
         </w:rPr>
-        <w:t xml:space="preserve">                            </w:t>
-      </w:r>
-      <w:r>
-        <w:rPr>
-          <w:sz w:val="18"/>
-          <w:szCs w:val="18"/>
-        </w:rPr>
         <w:t>{</w:t>
-      </w:r>
-    </w:p>
-    <w:p>
-      <w:pPr>
-        <w:pStyle w:val="CodeInvisible"/>
-        <w:rPr>
-          <w:sz w:val="18"/>
-          <w:szCs w:val="18"/>
-        </w:rPr>
-      </w:pPr>
-      <w:r>
-        <w:rPr>
-          <w:sz w:val="18"/>
-          <w:szCs w:val="18"/>
-        </w:rPr>
-        <w:t xml:space="preserve">                                &lt;div </w:t>
-      </w:r>
-      <w:proofErr w:type="spellStart"/>
-      <w:r>
-        <w:rPr>
-          <w:sz w:val="18"/>
-          <w:szCs w:val="18"/>
-        </w:rPr>
-        <w:t>href</w:t>
-      </w:r>
-      <w:proofErr w:type="spellEnd"/>
-      <w:r>
-        <w:rPr>
-          <w:sz w:val="18"/>
-          <w:szCs w:val="18"/>
-        </w:rPr>
-        <w:t xml:space="preserve">="#" class="card  border m-3 text-center </w:t>
-      </w:r>
-      <w:proofErr w:type="spellStart"/>
-      <w:r>
-        <w:rPr>
-          <w:sz w:val="18"/>
-          <w:szCs w:val="18"/>
-        </w:rPr>
-        <w:t>bg</w:t>
-      </w:r>
-      <w:proofErr w:type="spellEnd"/>
-      <w:r>
-        <w:rPr>
-          <w:sz w:val="18"/>
-          <w:szCs w:val="18"/>
-        </w:rPr>
-        <w:t xml:space="preserve">-warning" style="width: 20rem; background-image: </w:t>
-      </w:r>
-      <w:proofErr w:type="spellStart"/>
-      <w:r>
-        <w:rPr>
-          <w:sz w:val="18"/>
-          <w:szCs w:val="18"/>
-        </w:rPr>
-        <w:t>url</w:t>
-      </w:r>
-      <w:proofErr w:type="spellEnd"/>
-      <w:r>
-        <w:rPr>
-          <w:sz w:val="18"/>
-          <w:szCs w:val="18"/>
-        </w:rPr>
-        <w:t>('/images/</w:t>
-      </w:r>
-      <w:proofErr w:type="spellStart"/>
-      <w:r>
-        <w:rPr>
-          <w:sz w:val="18"/>
-          <w:szCs w:val="18"/>
-        </w:rPr>
-        <w:t>imagesLayout</w:t>
-      </w:r>
-      <w:proofErr w:type="spellEnd"/>
-      <w:r>
-        <w:rPr>
-          <w:sz w:val="18"/>
-          <w:szCs w:val="18"/>
-        </w:rPr>
-        <w:t>/Fond.png'); "&gt;</w:t>
-      </w:r>
-    </w:p>
-    <w:p>
-      <w:pPr>
-        <w:pStyle w:val="CodeInvisible"/>
-        <w:rPr>
-          <w:sz w:val="18"/>
-          <w:szCs w:val="18"/>
-        </w:rPr>
-      </w:pPr>
-      <w:r>
-        <w:rPr>
-          <w:sz w:val="18"/>
-          <w:szCs w:val="18"/>
-        </w:rPr>
-        <w:t xml:space="preserve">                                    &lt;div class="card-body  text-warning"&gt;</w:t>
-      </w:r>
-    </w:p>
-    <w:p>
-      <w:pPr>
-        <w:pStyle w:val="CodeInvisible"/>
-        <w:rPr>
-          <w:sz w:val="18"/>
-          <w:szCs w:val="18"/>
-        </w:rPr>
-      </w:pPr>
-      <w:r>
-        <w:rPr>
-          <w:sz w:val="18"/>
-          <w:szCs w:val="18"/>
-        </w:rPr>
-        <w:t xml:space="preserve">                                        &lt;h3 class="card-title"&gt; @zombie.Name &lt;/h3&gt;</w:t>
-      </w:r>
-    </w:p>
-    <w:p>
-      <w:pPr>
-        <w:pStyle w:val="CodeInvisible"/>
-        <w:rPr>
-          <w:sz w:val="18"/>
-          <w:szCs w:val="18"/>
-        </w:rPr>
-      </w:pPr>
-      <w:r>
-        <w:rPr>
-          <w:sz w:val="18"/>
-          <w:szCs w:val="18"/>
-        </w:rPr>
-        <w:t xml:space="preserve">                                        &lt;h5&gt; Points: @zombie.Point &lt;/h5&gt;</w:t>
-      </w:r>
-    </w:p>
-    <w:p>
-      <w:pPr>
-        <w:pStyle w:val="CodeInvisible"/>
-        <w:rPr>
-          <w:sz w:val="18"/>
-          <w:szCs w:val="18"/>
-        </w:rPr>
-      </w:pPr>
-      <w:r>
-        <w:rPr>
-          <w:sz w:val="18"/>
-          <w:szCs w:val="18"/>
-        </w:rPr>
-        <w:t xml:space="preserve">                                    &lt;/div&gt;</w:t>
-      </w:r>
-    </w:p>
-    <w:p>
-      <w:pPr>
-        <w:pStyle w:val="CodeInvisible"/>
-        <w:rPr>
-          <w:sz w:val="18"/>
-          <w:szCs w:val="18"/>
-        </w:rPr>
-      </w:pPr>
-      <w:r>
-        <w:rPr>
-          <w:sz w:val="18"/>
-          <w:szCs w:val="18"/>
-        </w:rPr>
-        <w:t xml:space="preserve">                                &lt;/div&gt;</w:t>
-      </w:r>
-    </w:p>
-    <w:p>
-      <w:pPr>
-        <w:pStyle w:val="CodeInvisible"/>
-        <w:rPr>
-          <w:sz w:val="18"/>
-          <w:szCs w:val="18"/>
-        </w:rPr>
-      </w:pPr>
-      <w:r>
-        <w:rPr>
-          <w:sz w:val="18"/>
-          <w:szCs w:val="18"/>
-        </w:rPr>
-        <w:t xml:space="preserve">                            }</w:t>
-      </w:r>
-    </w:p>
-    <w:p>
-      <w:pPr>
-        <w:pStyle w:val="CodeInvisible"/>
-        <w:rPr>
-          <w:sz w:val="18"/>
-          <w:szCs w:val="18"/>
-        </w:rPr>
-      </w:pPr>
-      <w:r>
-        <w:rPr>
-          <w:sz w:val="18"/>
-          <w:szCs w:val="18"/>
-        </w:rPr>
-        <w:t xml:space="preserve">                            @if (</w:t>
-      </w:r>
-      <w:proofErr w:type="spellStart"/>
-      <w:r>
-        <w:rPr>
-          <w:sz w:val="18"/>
-          <w:szCs w:val="18"/>
-        </w:rPr>
-        <w:t>zombieType.Zombies.Count</w:t>
-      </w:r>
-      <w:proofErr w:type="spellEnd"/>
-      <w:r>
-        <w:rPr>
-          <w:sz w:val="18"/>
-          <w:szCs w:val="18"/>
-        </w:rPr>
-        <w:t xml:space="preserve"> == 0)</w:t>
       </w:r>
     </w:p>
     <w:p>
@@ -6388,8 +4967,9 @@
         <w:rPr>
           <w:sz w:val="18"/>
           <w:szCs w:val="18"/>
-        </w:rPr>
-        <w:t xml:space="preserve">                            </w:t>
+          <w:lang w:val="fr-CA"/>
+        </w:rPr>
+        <w:t xml:space="preserve">                                </w:t>
       </w:r>
       <w:r>
         <w:rPr>
@@ -6397,87 +4977,7 @@
           <w:szCs w:val="18"/>
           <w:lang w:val="fr-CA"/>
         </w:rPr>
-        <w:t>{</w:t>
-      </w:r>
-    </w:p>
-    <w:p>
-      <w:pPr>
-        <w:pStyle w:val="CodeInvisible"/>
-        <w:rPr>
-          <w:sz w:val="18"/>
-          <w:szCs w:val="18"/>
-          <w:lang w:val="fr-CA"/>
-        </w:rPr>
-      </w:pPr>
-      <w:r>
-        <w:rPr>
-          <w:sz w:val="18"/>
-          <w:szCs w:val="18"/>
-          <w:lang w:val="fr-CA"/>
-        </w:rPr>
-        <w:t xml:space="preserve">                                </w:t>
-      </w:r>
-      <w:r>
-        <w:rPr>
-          <w:sz w:val="18"/>
-          <w:szCs w:val="18"/>
-          <w:lang w:val="fr-CA"/>
-        </w:rPr>
-        <w:t>&lt;</w:t>
-      </w:r>
-      <w:proofErr w:type="spellStart"/>
-      <w:r>
-        <w:rPr>
-          <w:sz w:val="18"/>
-          <w:szCs w:val="18"/>
-          <w:lang w:val="fr-CA"/>
-        </w:rPr>
-        <w:t>span</w:t>
-      </w:r>
-      <w:proofErr w:type="spellEnd"/>
-      <w:r>
-        <w:rPr>
-          <w:sz w:val="18"/>
-          <w:szCs w:val="18"/>
-          <w:lang w:val="fr-CA"/>
-        </w:rPr>
-        <w:t xml:space="preserve"> class="</w:t>
-      </w:r>
-      <w:proofErr w:type="spellStart"/>
-      <w:r>
-        <w:rPr>
-          <w:sz w:val="18"/>
-          <w:szCs w:val="18"/>
-          <w:lang w:val="fr-CA"/>
-        </w:rPr>
-        <w:t>text</w:t>
-      </w:r>
-      <w:proofErr w:type="spellEnd"/>
-      <w:r>
-        <w:rPr>
-          <w:sz w:val="18"/>
-          <w:szCs w:val="18"/>
-          <w:lang w:val="fr-CA"/>
-        </w:rPr>
-        <w:t>-danger"&gt;Aucun Zombie pour ce type&lt;/</w:t>
-      </w:r>
-      <w:proofErr w:type="spellStart"/>
-      <w:r>
-        <w:rPr>
-          <w:sz w:val="18"/>
-          <w:szCs w:val="18"/>
-          <w:lang w:val="fr-CA"/>
-        </w:rPr>
-        <w:t>span</w:t>
-      </w:r>
-      <w:proofErr w:type="spellEnd"/>
-      <w:r>
-        <w:rPr>
-          <w:sz w:val="18"/>
-          <w:szCs w:val="18"/>
-          <w:lang w:val="fr-CA"/>
-        </w:rPr>
-        <w:t>&gt;</w:t>
+        <w:t>&lt;span class="text-danger"&gt;Aucun Zombie pour ce type&lt;/span&gt;</w:t>
       </w:r>
     </w:p>
     <w:p>
@@ -6660,7 +5160,6 @@
       <w:r>
         <w:t xml:space="preserve">méthodes de </w:t>
       </w:r>
-      <w:proofErr w:type="spellStart"/>
       <w:r>
         <w:rPr>
           <w:b/>
@@ -6675,7 +5174,6 @@
         </w:rPr>
         <w:t>inq</w:t>
       </w:r>
-      <w:proofErr w:type="spellEnd"/>
       <w:r>
         <w:t>,</w:t>
       </w:r>
@@ -6692,15 +5190,7 @@
         <w:t>,</w:t>
       </w:r>
       <w:r>
-        <w:t xml:space="preserve"> contiennent leur équivalent </w:t>
-      </w:r>
-      <w:proofErr w:type="spellStart"/>
-      <w:r>
-        <w:t>async</w:t>
-      </w:r>
-      <w:proofErr w:type="spellEnd"/>
-      <w:r>
-        <w:t xml:space="preserve"> : </w:t>
+        <w:t xml:space="preserve"> contiennent leur équivalent async : </w:t>
       </w:r>
     </w:p>
     <w:tbl>
@@ -6924,7 +5414,6 @@
       <w:r>
         <w:t xml:space="preserve">pour la rendre </w:t>
       </w:r>
-      <w:proofErr w:type="spellStart"/>
       <w:r>
         <w:rPr>
           <w:b/>
@@ -6932,7 +5421,6 @@
         </w:rPr>
         <w:t>async</w:t>
       </w:r>
-      <w:proofErr w:type="spellEnd"/>
       <w:r>
         <w:t xml:space="preserve"> </w:t>
       </w:r>
@@ -6941,21 +5429,12 @@
       <w:r>
         <w:t xml:space="preserve">Ajoutez </w:t>
       </w:r>
-      <w:proofErr w:type="spellStart"/>
-      <w:r>
-        <w:rPr>
-          <w:b/>
-          <w:bCs/>
-        </w:rPr>
-        <w:t>await</w:t>
-      </w:r>
-      <w:proofErr w:type="spellEnd"/>
-      <w:r>
-        <w:rPr>
-          <w:b/>
-          <w:bCs/>
-        </w:rPr>
-        <w:t xml:space="preserve"> </w:t>
+      <w:r>
+        <w:rPr>
+          <w:b/>
+          <w:bCs/>
+        </w:rPr>
+        <w:t xml:space="preserve">await </w:t>
       </w:r>
       <w:r>
         <w:t>devant la requête au serveur et u</w:t>
@@ -6966,7 +5445,6 @@
       <w:r>
         <w:t xml:space="preserve">z </w:t>
       </w:r>
-      <w:proofErr w:type="spellStart"/>
       <w:r>
         <w:rPr>
           <w:b/>
@@ -6974,7 +5452,6 @@
         </w:rPr>
         <w:t>ToListAsync</w:t>
       </w:r>
-      <w:proofErr w:type="spellEnd"/>
       <w:r>
         <w:t>()</w:t>
       </w:r>
@@ -7081,7 +5558,6 @@
         </w:rPr>
         <w:t>Task&lt;</w:t>
       </w:r>
-      <w:proofErr w:type="spellStart"/>
       <w:r>
         <w:rPr>
           <w:rFonts w:ascii="Cascadia Mono" w:hAnsi="Cascadia Mono" w:cs="Cascadia Mono"/>
@@ -7112,7 +5588,6 @@
         </w:rPr>
         <w:t>ctionResult</w:t>
       </w:r>
-      <w:proofErr w:type="spellEnd"/>
       <w:r>
         <w:rPr>
           <w:rFonts w:ascii="Cascadia Mono" w:hAnsi="Cascadia Mono" w:cs="Cascadia Mono"/>
@@ -7198,7 +5673,6 @@
         </w:rPr>
         <w:t xml:space="preserve">    </w:t>
       </w:r>
-      <w:proofErr w:type="spellStart"/>
       <w:r>
         <w:rPr>
           <w:rFonts w:ascii="Cascadia Mono" w:hAnsi="Cascadia Mono" w:cs="Cascadia Mono"/>
@@ -7217,9 +5691,19 @@
           <w:szCs w:val="19"/>
           <w:lang w:val="en-CA"/>
         </w:rPr>
-        <w:t>.ViewBag.MaListe</w:t>
-      </w:r>
-      <w:proofErr w:type="spellEnd"/>
+        <w:t xml:space="preserve">.ViewBag.MaListe = </w:t>
+      </w:r>
+      <w:r>
+        <w:rPr>
+          <w:rFonts w:ascii="Cascadia Mono" w:hAnsi="Cascadia Mono" w:cs="Cascadia Mono"/>
+          <w:color w:val="0000FF"/>
+          <w:sz w:val="19"/>
+          <w:szCs w:val="19"/>
+          <w:highlight w:val="green"/>
+          <w:lang w:val="en-CA"/>
+        </w:rPr>
+        <w:t>await</w:t>
+      </w:r>
       <w:r>
         <w:rPr>
           <w:rFonts w:ascii="Cascadia Mono" w:hAnsi="Cascadia Mono" w:cs="Cascadia Mono"/>
@@ -7228,7 +5712,7 @@
           <w:szCs w:val="19"/>
           <w:lang w:val="en-CA"/>
         </w:rPr>
-        <w:t xml:space="preserve"> = </w:t>
+        <w:t xml:space="preserve"> </w:t>
       </w:r>
       <w:r>
         <w:rPr>
@@ -7236,10 +5720,9 @@
           <w:color w:val="0000FF"/>
           <w:sz w:val="19"/>
           <w:szCs w:val="19"/>
-          <w:highlight w:val="green"/>
-          <w:lang w:val="en-CA"/>
-        </w:rPr>
-        <w:t>await</w:t>
+          <w:lang w:val="en-CA"/>
+        </w:rPr>
+        <w:t>this</w:t>
       </w:r>
       <w:r>
         <w:rPr>
@@ -7249,17 +5732,7 @@
           <w:szCs w:val="19"/>
           <w:lang w:val="en-CA"/>
         </w:rPr>
-        <w:t xml:space="preserve"> </w:t>
-      </w:r>
-      <w:r>
-        <w:rPr>
-          <w:rFonts w:ascii="Cascadia Mono" w:hAnsi="Cascadia Mono" w:cs="Cascadia Mono"/>
-          <w:color w:val="0000FF"/>
-          <w:sz w:val="19"/>
-          <w:szCs w:val="19"/>
-          <w:lang w:val="en-CA"/>
-        </w:rPr>
-        <w:t>this</w:t>
+        <w:t>.</w:t>
       </w:r>
       <w:r>
         <w:rPr>
@@ -7267,6 +5740,16 @@
           <w:color w:val="000000"/>
           <w:sz w:val="19"/>
           <w:szCs w:val="19"/>
+          <w:lang w:val="en-US"/>
+        </w:rPr>
+        <w:t>_baseDonnees.ZombieTypes</w:t>
+      </w:r>
+      <w:r>
+        <w:rPr>
+          <w:rFonts w:ascii="Cascadia Mono" w:hAnsi="Cascadia Mono" w:cs="Cascadia Mono"/>
+          <w:color w:val="000000"/>
+          <w:sz w:val="19"/>
+          <w:szCs w:val="19"/>
           <w:lang w:val="en-CA"/>
         </w:rPr>
         <w:t>.</w:t>
@@ -7277,45 +5760,11 @@
           <w:color w:val="000000"/>
           <w:sz w:val="19"/>
           <w:szCs w:val="19"/>
-          <w:lang w:val="en-US"/>
-        </w:rPr>
-        <w:t>_</w:t>
-      </w:r>
-      <w:proofErr w:type="spellStart"/>
-      <w:r>
-        <w:rPr>
-          <w:rFonts w:ascii="Cascadia Mono" w:hAnsi="Cascadia Mono" w:cs="Cascadia Mono"/>
-          <w:color w:val="000000"/>
-          <w:sz w:val="19"/>
-          <w:szCs w:val="19"/>
-          <w:lang w:val="en-US"/>
-        </w:rPr>
-        <w:t>baseDonnees.ZombieTypes</w:t>
-      </w:r>
-      <w:proofErr w:type="spellEnd"/>
-      <w:r>
-        <w:rPr>
-          <w:rFonts w:ascii="Cascadia Mono" w:hAnsi="Cascadia Mono" w:cs="Cascadia Mono"/>
-          <w:color w:val="000000"/>
-          <w:sz w:val="19"/>
-          <w:szCs w:val="19"/>
-          <w:lang w:val="en-CA"/>
-        </w:rPr>
-        <w:t>.</w:t>
-      </w:r>
-      <w:proofErr w:type="spellStart"/>
-      <w:r>
-        <w:rPr>
-          <w:rFonts w:ascii="Cascadia Mono" w:hAnsi="Cascadia Mono" w:cs="Cascadia Mono"/>
-          <w:color w:val="000000"/>
-          <w:sz w:val="19"/>
-          <w:szCs w:val="19"/>
           <w:highlight w:val="cyan"/>
           <w:lang w:val="en-CA"/>
         </w:rPr>
         <w:t>ToListAsync</w:t>
       </w:r>
-      <w:proofErr w:type="spellEnd"/>
       <w:r>
         <w:rPr>
           <w:rFonts w:ascii="Cascadia Mono" w:hAnsi="Cascadia Mono" w:cs="Cascadia Mono"/>
@@ -7433,15 +5882,7 @@
         <w:t>REMARQUE</w:t>
       </w:r>
       <w:r>
-        <w:t xml:space="preserve"> : Comme </w:t>
-      </w:r>
-      <w:proofErr w:type="spellStart"/>
-      <w:r>
-        <w:t>ViewBag</w:t>
-      </w:r>
-      <w:proofErr w:type="spellEnd"/>
-      <w:r>
-        <w:t xml:space="preserve"> n’est pas fortement typé, </w:t>
+        <w:t xml:space="preserve"> : Comme ViewBag n’est pas fortement typé, </w:t>
       </w:r>
       <w:r>
         <w:t xml:space="preserve">ici </w:t>
@@ -7455,7 +5896,6 @@
       <w:r>
         <w:t xml:space="preserve"> met pas </w:t>
       </w:r>
-      <w:proofErr w:type="spellStart"/>
       <w:r>
         <w:rPr>
           <w:b/>
@@ -7463,7 +5903,6 @@
         </w:rPr>
         <w:t>await</w:t>
       </w:r>
-      <w:proofErr w:type="spellEnd"/>
       <w:r>
         <w:rPr>
           <w:b/>
@@ -7481,7 +5920,6 @@
       <w:r>
         <w:t xml:space="preserve">le code va s’exécuter, mais </w:t>
       </w:r>
-      <w:proofErr w:type="spellStart"/>
       <w:r>
         <w:rPr>
           <w:b/>
@@ -7489,11 +5927,9 @@
         </w:rPr>
         <w:t>MaListe</w:t>
       </w:r>
-      <w:proofErr w:type="spellEnd"/>
       <w:r>
         <w:t xml:space="preserve"> ne sera que le </w:t>
       </w:r>
-      <w:proofErr w:type="spellStart"/>
       <w:r>
         <w:rPr>
           <w:b/>
@@ -7501,7 +5937,6 @@
         </w:rPr>
         <w:t>Task</w:t>
       </w:r>
-      <w:proofErr w:type="spellEnd"/>
       <w:r>
         <w:t xml:space="preserve"> et non le résultat.</w:t>
       </w:r>
@@ -7544,7 +5979,6 @@
       <w:r>
         <w:t xml:space="preserve">N’oubliez pas le </w:t>
       </w:r>
-      <w:proofErr w:type="spellStart"/>
       <w:r>
         <w:rPr>
           <w:b/>
@@ -7559,7 +5993,6 @@
         </w:rPr>
         <w:t>Async</w:t>
       </w:r>
-      <w:proofErr w:type="spellEnd"/>
     </w:p>
     <w:p>
       <w:pPr>
@@ -7582,7 +6015,6 @@
       <w:r>
         <w:t xml:space="preserve"> de </w:t>
       </w:r>
-      <w:proofErr w:type="spellStart"/>
       <w:r>
         <w:rPr>
           <w:b/>
@@ -7590,7 +6022,6 @@
         </w:rPr>
         <w:t>UpdateAsync</w:t>
       </w:r>
-      <w:proofErr w:type="spellEnd"/>
       <w:r>
         <w:rPr>
           <w:b/>
@@ -7608,7 +6039,6 @@
       <w:r>
         <w:t xml:space="preserve">ni de </w:t>
       </w:r>
-      <w:proofErr w:type="spellStart"/>
       <w:r>
         <w:rPr>
           <w:b/>
@@ -7623,7 +6053,6 @@
         </w:rPr>
         <w:t>Async</w:t>
       </w:r>
-      <w:proofErr w:type="spellEnd"/>
       <w:r>
         <w:rPr>
           <w:b/>
@@ -7646,7 +6075,6 @@
       <w:r>
         <w:t xml:space="preserve">Il n’y a pas non plus de </w:t>
       </w:r>
-      <w:proofErr w:type="spellStart"/>
       <w:r>
         <w:rPr>
           <w:b/>
@@ -7654,29 +6082,12 @@
         </w:rPr>
         <w:t>WhereAsync</w:t>
       </w:r>
-      <w:proofErr w:type="spellEnd"/>
-      <w:r>
-        <w:rPr>
-          <w:b/>
-          <w:bCs/>
-        </w:rPr>
-        <w:t xml:space="preserve">, </w:t>
-      </w:r>
-      <w:proofErr w:type="spellStart"/>
-      <w:r>
-        <w:rPr>
-          <w:b/>
-          <w:bCs/>
-        </w:rPr>
-        <w:t>SelectAsync</w:t>
-      </w:r>
-      <w:proofErr w:type="spellEnd"/>
-      <w:r>
-        <w:rPr>
-          <w:b/>
-          <w:bCs/>
-        </w:rPr>
-        <w:t xml:space="preserve">… </w:t>
+      <w:r>
+        <w:rPr>
+          <w:b/>
+          <w:bCs/>
+        </w:rPr>
+        <w:t xml:space="preserve">, SelectAsync… </w:t>
       </w:r>
       <w:r>
         <w:t>(</w:t>
@@ -7823,7 +6234,6 @@
       <w:r>
         <w:t xml:space="preserve">tudio de rendre la méthode </w:t>
       </w:r>
-      <w:proofErr w:type="spellStart"/>
       <w:r>
         <w:rPr>
           <w:b/>
@@ -7831,11 +6241,9 @@
         </w:rPr>
         <w:t>async</w:t>
       </w:r>
-      <w:proofErr w:type="spellEnd"/>
       <w:r>
         <w:t xml:space="preserve">, il va modifier le nom de votre méthode avec le suffixe </w:t>
       </w:r>
-      <w:proofErr w:type="spellStart"/>
       <w:r>
         <w:rPr>
           <w:b/>
@@ -7843,7 +6251,6 @@
         </w:rPr>
         <w:t>Async</w:t>
       </w:r>
-      <w:proofErr w:type="spellEnd"/>
       <w:r>
         <w:t xml:space="preserve">. Pour les classes normales ça va, mais pour les contrôleurs, où le nom de </w:t>
       </w:r>
@@ -7880,7 +6287,6 @@
       <w:r>
         <w:t xml:space="preserve"> </w:t>
       </w:r>
-      <w:proofErr w:type="spellStart"/>
       <w:r>
         <w:rPr>
           <w:b/>
@@ -7895,7 +6301,6 @@
         </w:rPr>
         <w:t>Controller</w:t>
       </w:r>
-      <w:proofErr w:type="spellEnd"/>
       <w:r>
         <w:t xml:space="preserve"> </w:t>
       </w:r>
@@ -7930,7 +6335,6 @@
       <w:r>
         <w:t xml:space="preserve"> </w:t>
       </w:r>
-      <w:proofErr w:type="spellStart"/>
       <w:r>
         <w:rPr>
           <w:b/>
@@ -7959,11 +6363,9 @@
         </w:rPr>
         <w:t>Controller</w:t>
       </w:r>
-      <w:proofErr w:type="spellEnd"/>
       <w:r>
         <w:t xml:space="preserve"> et </w:t>
       </w:r>
-      <w:proofErr w:type="spellStart"/>
       <w:r>
         <w:rPr>
           <w:b/>
@@ -7978,7 +6380,6 @@
         </w:rPr>
         <w:t>Controller</w:t>
       </w:r>
-      <w:proofErr w:type="spellEnd"/>
       <w:r>
         <w:t xml:space="preserve"> sont déjà en asynchrone.</w:t>
       </w:r>
@@ -8085,7 +6486,6 @@
         </w:numPr>
         <w:spacing w:before="0" w:after="160" w:line="259" w:lineRule="auto"/>
       </w:pPr>
-      <w:proofErr w:type="spellStart"/>
       <w:r>
         <w:rPr>
           <w:b/>
@@ -8093,18 +6493,15 @@
         </w:rPr>
         <w:t>Summary</w:t>
       </w:r>
-      <w:proofErr w:type="spellEnd"/>
       <w:r>
         <w:t xml:space="preserve">: </w:t>
       </w:r>
       <w:r>
         <w:t xml:space="preserve">REFACTOR </w:t>
       </w:r>
-      <w:proofErr w:type="spellStart"/>
       <w:r>
         <w:t>Async</w:t>
       </w:r>
-      <w:proofErr w:type="spellEnd"/>
       <w:r>
         <w:t xml:space="preserve"> Z</w:t>
       </w:r>
@@ -8189,7 +6586,6 @@
       <w:r>
         <w:t xml:space="preserve"> sur le repo en ligne </w:t>
       </w:r>
-      <w:proofErr w:type="spellStart"/>
       <w:r>
         <w:rPr>
           <w:b/>
@@ -8197,7 +6593,6 @@
         </w:rPr>
         <w:t>Remote</w:t>
       </w:r>
-      <w:proofErr w:type="spellEnd"/>
       <w:r>
         <w:t xml:space="preserve">: cliquez sur </w:t>
       </w:r>
@@ -8263,31 +6658,7 @@
           <w:u w:val="single"/>
           <w:lang w:val="en-CA"/>
         </w:rPr>
-        <w:t xml:space="preserve">Fin du </w:t>
-      </w:r>
-      <w:proofErr w:type="spellStart"/>
-      <w:r>
-        <w:rPr>
-          <w:b/>
-          <w:bCs/>
-          <w:sz w:val="28"/>
-          <w:szCs w:val="28"/>
-          <w:u w:val="single"/>
-          <w:lang w:val="en-CA"/>
-        </w:rPr>
-        <w:t>laboratoire</w:t>
-      </w:r>
-      <w:proofErr w:type="spellEnd"/>
-      <w:r>
-        <w:rPr>
-          <w:b/>
-          <w:bCs/>
-          <w:sz w:val="28"/>
-          <w:szCs w:val="28"/>
-          <w:u w:val="single"/>
-          <w:lang w:val="en-CA"/>
-        </w:rPr>
-        <w:t>!</w:t>
+        <w:t>Fin du laboratoire!</w:t>
       </w:r>
     </w:p>
     <w:sectPr>
@@ -13457,10 +11828,6 @@
 </file>
 
 <file path=customXml/item1.xml><?xml version="1.0" encoding="utf-8"?>
-<b:Sources xmlns:b="http://schemas.openxmlformats.org/officeDocument/2006/bibliography" xmlns="http://schemas.openxmlformats.org/officeDocument/2006/bibliography" SelectedStyle="\APASixthEditionOfficeOnline.xsl" StyleName="APA" Version="6"/>
-</file>
-
-<file path=customXml/item2.xml><?xml version="1.0" encoding="utf-8"?>
 <ct:contentTypeSchema xmlns:ct="http://schemas.microsoft.com/office/2006/metadata/contentType" xmlns:ma="http://schemas.microsoft.com/office/2006/metadata/properties/metaAttributes" ct:_="" ma:_="" ma:contentTypeName="Document" ma:contentTypeID="0x010100354AEAE9FD62D747A26A546E5B1B5735" ma:contentTypeVersion="7" ma:contentTypeDescription="Crée un document." ma:contentTypeScope="" ma:versionID="43b763fe9aa20b7a2976a5e019d82dbf">
   <xsd:schema xmlns:xsd="http://www.w3.org/2001/XMLSchema" xmlns:xs="http://www.w3.org/2001/XMLSchema" xmlns:p="http://schemas.microsoft.com/office/2006/metadata/properties" xmlns:ns2="071933db-0376-4694-9786-b56cb37c4ec2" targetNamespace="http://schemas.microsoft.com/office/2006/metadata/properties" ma:root="true" ma:fieldsID="d5c90ae6c1ec6ed317c9f5feddaf7a33" ns2:_="">
     <xsd:import namespace="071933db-0376-4694-9786-b56cb37c4ec2"/>
@@ -13624,13 +11991,11 @@
 </ct:contentTypeSchema>
 </file>
 
-<file path=customXml/item3.xml><?xml version="1.0" encoding="utf-8"?>
-<p:properties xmlns:p="http://schemas.microsoft.com/office/2006/metadata/properties" xmlns:xsi="http://www.w3.org/2001/XMLSchema-instance" xmlns:pc="http://schemas.microsoft.com/office/infopath/2007/PartnerControls">
-  <documentManagement/>
-</p:properties>
+<file path=customXml/item2.xml><?xml version="1.0" encoding="utf-8"?>
+<b:Sources xmlns:b="http://schemas.openxmlformats.org/officeDocument/2006/bibliography" xmlns="http://schemas.openxmlformats.org/officeDocument/2006/bibliography" SelectedStyle="\APASixthEditionOfficeOnline.xsl" StyleName="APA" Version="6"/>
 </file>
 
-<file path=customXml/item4.xml><?xml version="1.0" encoding="utf-8"?>
+<file path=customXml/item3.xml><?xml version="1.0" encoding="utf-8"?>
 <?mso-contentType ?>
 <FormTemplates xmlns="http://schemas.microsoft.com/sharepoint/v3/contenttype/forms">
   <Display>DocumentLibraryForm</Display>
@@ -13639,15 +12004,13 @@
 </FormTemplates>
 </file>
 
-<file path=customXml/itemProps1.xml><?xml version="1.0" encoding="utf-8"?>
-<ds:datastoreItem xmlns:ds="http://schemas.openxmlformats.org/officeDocument/2006/customXml" ds:itemID="{28D15B86-D92D-420E-A893-C7613CFD01AE}">
-  <ds:schemaRefs>
-    <ds:schemaRef ds:uri="http://schemas.openxmlformats.org/officeDocument/2006/bibliography"/>
-  </ds:schemaRefs>
-</ds:datastoreItem>
+<file path=customXml/item4.xml><?xml version="1.0" encoding="utf-8"?>
+<p:properties xmlns:p="http://schemas.microsoft.com/office/2006/metadata/properties" xmlns:xsi="http://www.w3.org/2001/XMLSchema-instance" xmlns:pc="http://schemas.microsoft.com/office/infopath/2007/PartnerControls">
+  <documentManagement/>
+</p:properties>
 </file>
 
-<file path=customXml/itemProps2.xml><?xml version="1.0" encoding="utf-8"?>
+<file path=customXml/itemProps1.xml><?xml version="1.0" encoding="utf-8"?>
 <ds:datastoreItem xmlns:ds="http://schemas.openxmlformats.org/officeDocument/2006/customXml" ds:itemID="{5C3A06EC-DC03-4D65-AA15-C6B9D68C1ED0}">
   <ds:schemaRefs>
     <ds:schemaRef ds:uri="http://schemas.microsoft.com/office/2006/metadata/contentType"/>
@@ -13665,19 +12028,27 @@
 </ds:datastoreItem>
 </file>
 
+<file path=customXml/itemProps2.xml><?xml version="1.0" encoding="utf-8"?>
+<ds:datastoreItem xmlns:ds="http://schemas.openxmlformats.org/officeDocument/2006/customXml" ds:itemID="{28D15B86-D92D-420E-A893-C7613CFD01AE}">
+  <ds:schemaRefs>
+    <ds:schemaRef ds:uri="http://schemas.openxmlformats.org/officeDocument/2006/bibliography"/>
+  </ds:schemaRefs>
+</ds:datastoreItem>
+</file>
+
 <file path=customXml/itemProps3.xml><?xml version="1.0" encoding="utf-8"?>
+<ds:datastoreItem xmlns:ds="http://schemas.openxmlformats.org/officeDocument/2006/customXml" ds:itemID="{F6194C16-5FE5-4670-BEC8-3D6DD9380312}">
+  <ds:schemaRefs>
+    <ds:schemaRef ds:uri="http://schemas.microsoft.com/sharepoint/v3/contenttype/forms"/>
+  </ds:schemaRefs>
+</ds:datastoreItem>
+</file>
+
+<file path=customXml/itemProps4.xml><?xml version="1.0" encoding="utf-8"?>
 <ds:datastoreItem xmlns:ds="http://schemas.openxmlformats.org/officeDocument/2006/customXml" ds:itemID="{2C36E056-BA2C-4A1F-9580-242C9B36FE70}">
   <ds:schemaRefs>
     <ds:schemaRef ds:uri="http://schemas.microsoft.com/office/2006/metadata/properties"/>
     <ds:schemaRef ds:uri="http://schemas.microsoft.com/office/infopath/2007/PartnerControls"/>
   </ds:schemaRefs>
 </ds:datastoreItem>
-</file>
-
-<file path=customXml/itemProps4.xml><?xml version="1.0" encoding="utf-8"?>
-<ds:datastoreItem xmlns:ds="http://schemas.openxmlformats.org/officeDocument/2006/customXml" ds:itemID="{F6194C16-5FE5-4670-BEC8-3D6DD9380312}">
-  <ds:schemaRefs>
-    <ds:schemaRef ds:uri="http://schemas.microsoft.com/sharepoint/v3/contenttype/forms"/>
-  </ds:schemaRefs>
-</ds:datastoreItem>
 </file>
</xml_diff>